<commit_message>
Finals deck: regenerate speaker script .docx (Taroko case slide)
Co-Authored-By: Claude Opus 5.5 <noreply@anthropic.com>
</commit_message>
<xml_diff>
--- a/presentation/講稿與背景說明.docx
+++ b/presentation/講稿與背景說明.docx
@@ -84,7 +84,7 @@
       <w:tr>
         <w:tc>
           <w:tcPr>
-            <w:tcW w:type="dxa" w:w="1214"/>
+            <w:tcW w:type="dxa" w:w="1076"/>
             <w:shd w:val="clear" w:color="auto" w:fill="2C5F2D"/>
           </w:tcPr>
           <w:p>
@@ -107,7 +107,7 @@
         </w:tc>
         <w:tc>
           <w:tcPr>
-            <w:tcW w:type="dxa" w:w="5768"/>
+            <w:tcW w:type="dxa" w:w="6184"/>
             <w:shd w:val="clear" w:color="auto" w:fill="2C5F2D"/>
           </w:tcPr>
           <w:p>
@@ -130,7 +130,7 @@
         </w:tc>
         <w:tc>
           <w:tcPr>
-            <w:tcW w:type="dxa" w:w="1214"/>
+            <w:tcW w:type="dxa" w:w="1076"/>
             <w:shd w:val="clear" w:color="auto" w:fill="2C5F2D"/>
           </w:tcPr>
           <w:p>
@@ -153,7 +153,7 @@
         </w:tc>
         <w:tc>
           <w:tcPr>
-            <w:tcW w:type="dxa" w:w="1214"/>
+            <w:tcW w:type="dxa" w:w="1076"/>
             <w:shd w:val="clear" w:color="auto" w:fill="2C5F2D"/>
           </w:tcPr>
           <w:p>
@@ -178,7 +178,7 @@
       <w:tr>
         <w:tc>
           <w:tcPr>
-            <w:tcW w:type="dxa" w:w="1214"/>
+            <w:tcW w:type="dxa" w:w="1076"/>
           </w:tcPr>
           <w:p>
             <w:r/>
@@ -194,7 +194,7 @@
         </w:tc>
         <w:tc>
           <w:tcPr>
-            <w:tcW w:type="dxa" w:w="5768"/>
+            <w:tcW w:type="dxa" w:w="6184"/>
           </w:tcPr>
           <w:p>
             <w:r/>
@@ -210,7 +210,7 @@
         </w:tc>
         <w:tc>
           <w:tcPr>
-            <w:tcW w:type="dxa" w:w="1214"/>
+            <w:tcW w:type="dxa" w:w="1076"/>
           </w:tcPr>
           <w:p>
             <w:r/>
@@ -226,7 +226,7 @@
         </w:tc>
         <w:tc>
           <w:tcPr>
-            <w:tcW w:type="dxa" w:w="1214"/>
+            <w:tcW w:type="dxa" w:w="1076"/>
           </w:tcPr>
           <w:p>
             <w:r/>
@@ -244,7 +244,7 @@
       <w:tr>
         <w:tc>
           <w:tcPr>
-            <w:tcW w:type="dxa" w:w="1214"/>
+            <w:tcW w:type="dxa" w:w="1076"/>
           </w:tcPr>
           <w:p>
             <w:r/>
@@ -260,7 +260,7 @@
         </w:tc>
         <w:tc>
           <w:tcPr>
-            <w:tcW w:type="dxa" w:w="5768"/>
+            <w:tcW w:type="dxa" w:w="6184"/>
           </w:tcPr>
           <w:p>
             <w:r/>
@@ -276,7 +276,7 @@
         </w:tc>
         <w:tc>
           <w:tcPr>
-            <w:tcW w:type="dxa" w:w="1214"/>
+            <w:tcW w:type="dxa" w:w="1076"/>
           </w:tcPr>
           <w:p>
             <w:r/>
@@ -292,7 +292,7 @@
         </w:tc>
         <w:tc>
           <w:tcPr>
-            <w:tcW w:type="dxa" w:w="1214"/>
+            <w:tcW w:type="dxa" w:w="1076"/>
           </w:tcPr>
           <w:p>
             <w:r/>
@@ -310,7 +310,7 @@
       <w:tr>
         <w:tc>
           <w:tcPr>
-            <w:tcW w:type="dxa" w:w="1214"/>
+            <w:tcW w:type="dxa" w:w="1076"/>
           </w:tcPr>
           <w:p>
             <w:r/>
@@ -326,7 +326,7 @@
         </w:tc>
         <w:tc>
           <w:tcPr>
-            <w:tcW w:type="dxa" w:w="5768"/>
+            <w:tcW w:type="dxa" w:w="6184"/>
           </w:tcPr>
           <w:p>
             <w:r/>
@@ -342,7 +342,7 @@
         </w:tc>
         <w:tc>
           <w:tcPr>
-            <w:tcW w:type="dxa" w:w="1214"/>
+            <w:tcW w:type="dxa" w:w="1076"/>
           </w:tcPr>
           <w:p>
             <w:r/>
@@ -358,7 +358,7 @@
         </w:tc>
         <w:tc>
           <w:tcPr>
-            <w:tcW w:type="dxa" w:w="1214"/>
+            <w:tcW w:type="dxa" w:w="1076"/>
           </w:tcPr>
           <w:p>
             <w:r/>
@@ -376,7 +376,7 @@
       <w:tr>
         <w:tc>
           <w:tcPr>
-            <w:tcW w:type="dxa" w:w="1214"/>
+            <w:tcW w:type="dxa" w:w="1076"/>
           </w:tcPr>
           <w:p>
             <w:r/>
@@ -392,7 +392,7 @@
         </w:tc>
         <w:tc>
           <w:tcPr>
-            <w:tcW w:type="dxa" w:w="5768"/>
+            <w:tcW w:type="dxa" w:w="6184"/>
           </w:tcPr>
           <w:p>
             <w:r/>
@@ -402,13 +402,13 @@
                 <w:i w:val="0"/>
                 <w:sz w:val="20"/>
               </w:rPr>
-              <w:t>每個坡面一頁（操作錄影 27 秒）</w:t>
+              <w:t>案例：太魯閣 0403 地震，一個坡面的證據鏈</w:t>
             </w:r>
           </w:p>
         </w:tc>
         <w:tc>
           <w:tcPr>
-            <w:tcW w:type="dxa" w:w="1214"/>
+            <w:tcW w:type="dxa" w:w="1076"/>
           </w:tcPr>
           <w:p>
             <w:r/>
@@ -424,7 +424,7 @@
         </w:tc>
         <w:tc>
           <w:tcPr>
-            <w:tcW w:type="dxa" w:w="1214"/>
+            <w:tcW w:type="dxa" w:w="1076"/>
           </w:tcPr>
           <w:p>
             <w:r/>
@@ -442,7 +442,7 @@
       <w:tr>
         <w:tc>
           <w:tcPr>
-            <w:tcW w:type="dxa" w:w="1214"/>
+            <w:tcW w:type="dxa" w:w="1076"/>
           </w:tcPr>
           <w:p>
             <w:r/>
@@ -458,7 +458,7 @@
         </w:tc>
         <w:tc>
           <w:tcPr>
-            <w:tcW w:type="dxa" w:w="5768"/>
+            <w:tcW w:type="dxa" w:w="6184"/>
           </w:tcPr>
           <w:p>
             <w:r/>
@@ -474,7 +474,7 @@
         </w:tc>
         <w:tc>
           <w:tcPr>
-            <w:tcW w:type="dxa" w:w="1214"/>
+            <w:tcW w:type="dxa" w:w="1076"/>
           </w:tcPr>
           <w:p>
             <w:r/>
@@ -490,7 +490,7 @@
         </w:tc>
         <w:tc>
           <w:tcPr>
-            <w:tcW w:type="dxa" w:w="1214"/>
+            <w:tcW w:type="dxa" w:w="1076"/>
           </w:tcPr>
           <w:p>
             <w:r/>
@@ -508,7 +508,7 @@
       <w:tr>
         <w:tc>
           <w:tcPr>
-            <w:tcW w:type="dxa" w:w="1214"/>
+            <w:tcW w:type="dxa" w:w="1076"/>
           </w:tcPr>
           <w:p>
             <w:r/>
@@ -524,7 +524,7 @@
         </w:tc>
         <w:tc>
           <w:tcPr>
-            <w:tcW w:type="dxa" w:w="5768"/>
+            <w:tcW w:type="dxa" w:w="6184"/>
           </w:tcPr>
           <w:p>
             <w:r/>
@@ -540,7 +540,7 @@
         </w:tc>
         <w:tc>
           <w:tcPr>
-            <w:tcW w:type="dxa" w:w="1214"/>
+            <w:tcW w:type="dxa" w:w="1076"/>
           </w:tcPr>
           <w:p>
             <w:r/>
@@ -556,7 +556,7 @@
         </w:tc>
         <w:tc>
           <w:tcPr>
-            <w:tcW w:type="dxa" w:w="1214"/>
+            <w:tcW w:type="dxa" w:w="1076"/>
           </w:tcPr>
           <w:p>
             <w:r/>
@@ -1152,43 +1152,7 @@
           <w:color w:val="2C5F2D"/>
           <w:sz w:val="30"/>
         </w:rPr>
-        <w:t>第 4 頁　每個坡面一頁</w:t>
-      </w:r>
-    </w:p>
-    <w:p>
-      <w:r>
-        <w:rPr>
-          <w:rFonts w:ascii="Microsoft JhengHei" w:hAnsi="Microsoft JhengHei" w:eastAsia="Microsoft JhengHei" w:cs="Microsoft JhengHei"/>
-          <w:b/>
-          <w:i w:val="0"/>
-          <w:sz w:val="22"/>
-        </w:rPr>
-        <w:t>操作</w:t>
-      </w:r>
-      <w:r>
-        <w:rPr>
-          <w:rFonts w:ascii="Microsoft JhengHei" w:hAnsi="Microsoft JhengHei" w:eastAsia="Microsoft JhengHei" w:cs="Microsoft JhengHei"/>
-          <w:i w:val="0"/>
-          <w:sz w:val="22"/>
-        </w:rPr>
-        <w:t>：</w:t>
-      </w:r>
-      <w:r>
-        <w:rPr>
-          <w:rFonts w:ascii="Microsoft JhengHei" w:hAnsi="Microsoft JhengHei" w:eastAsia="Microsoft JhengHei" w:cs="Microsoft JhengHei"/>
-          <w:b/>
-          <w:i w:val="0"/>
-          <w:sz w:val="22"/>
-        </w:rPr>
-        <w:t>先點一下影片開始播放</w:t>
-      </w:r>
-      <w:r>
-        <w:rPr>
-          <w:rFonts w:ascii="Microsoft JhengHei" w:hAnsi="Microsoft JhengHei" w:eastAsia="Microsoft JhengHei" w:cs="Microsoft JhengHei"/>
-          <w:i w:val="0"/>
-          <w:sz w:val="22"/>
-        </w:rPr>
-        <w:t>，再開始講。影片 27 秒，講稿 45 秒，影片放完停在最後畫面即可。</w:t>
+        <w:t>第 4 頁　案例：太魯閣 0403 地震，一個坡面的證據鏈</w:t>
       </w:r>
     </w:p>
     <w:p>
@@ -1215,7 +1179,7 @@
           <w:i w:val="0"/>
           <w:sz w:val="24"/>
         </w:rPr>
-        <w:t>這是線上系統的坡面頁操作。地圖上紅色是官方判釋的崩塌，黃線是這個坡面。右邊依序是為什麼列為優先、事件歷史、近期衛星變化曲線，還可以切換 Wayback 歷史影像做人工目視確認。整個高雄 POC 目前有 411 個坡面列為優先人工判讀。</w:t>
+        <w:t>看一個太魯閣的例子。白線是一個坡面，橘線是官方事件目錄圈出的地震崩塌，占了這個坡面的一半。地震前 3 月底，紅邊指標 0.53；地震後 11 天掉到 0.20，之後一直沒有回來，而全區中位數只是正常的季節起伏。事件目錄、衛星變化兩類證據指向同一件事，這個坡面就會被列入人工判讀候選，最後由人決定要不要去。線上系統的太魯閣頁可以看到全部 329 個下降坡面。</w:t>
       </w:r>
     </w:p>
     <w:p>
@@ -1239,7 +1203,7 @@
           <w:i w:val="0"/>
           <w:sz w:val="22"/>
         </w:rPr>
-        <w:t xml:space="preserve">影片中的坡面是 </w:t>
+        <w:t xml:space="preserve">坡面 </w:t>
       </w:r>
       <w:r>
         <w:rPr>
@@ -1247,7 +1211,7 @@
           <w:i w:val="0"/>
           <w:sz w:val="20"/>
         </w:rPr>
-        <w:t>SU2-11497-129153</w:t>
+        <w:t>SU2-15759-134182</w:t>
       </w:r>
       <w:r>
         <w:rPr>
@@ -1255,7 +1219,7 @@
           <w:i w:val="0"/>
           <w:sz w:val="22"/>
         </w:rPr>
-        <w:t>：凱米颱風（2024-07-23）在此坡面新增 0.81 ha，NDRE 自 7/23 起持續下降。</w:t>
+        <w:t>：有效坡面 21.4 ha，事件目錄（2024-04-03 花蓮地震）在此坡面 10.7 ha。</w:t>
       </w:r>
     </w:p>
     <w:p>
@@ -1265,19 +1229,10 @@
       <w:r>
         <w:rPr>
           <w:rFonts w:ascii="Microsoft JhengHei" w:hAnsi="Microsoft JhengHei" w:eastAsia="Microsoft JhengHei" w:cs="Microsoft JhengHei"/>
-          <w:b/>
           <w:i w:val="0"/>
           <w:sz w:val="22"/>
         </w:rPr>
-        <w:t>Wayback 選單</w:t>
-      </w:r>
-      <w:r>
-        <w:rPr>
-          <w:rFonts w:ascii="Microsoft JhengHei" w:hAnsi="Microsoft JhengHei" w:eastAsia="Microsoft JhengHei" w:cs="Microsoft JhengHei"/>
-          <w:i w:val="0"/>
-          <w:sz w:val="22"/>
-        </w:rPr>
-        <w:t>：只列地圖中心那一格實際有影像變化的版本，標拍攝日；第一次查詢約 10–40 秒。</w:t>
+        <w:t>左邊動態圖是 Sentinel-2 真彩色 2024-03-25（地震前）與 2024-04-14（地震後 11 天），已做對比增強，投影時自動交替；PDF 版只顯示第一張。這一帶沒有地震後的 Wayback 高解析影像。</w:t>
       </w:r>
     </w:p>
     <w:p>
@@ -1287,19 +1242,10 @@
       <w:r>
         <w:rPr>
           <w:rFonts w:ascii="Microsoft JhengHei" w:hAnsi="Microsoft JhengHei" w:eastAsia="Microsoft JhengHei" w:cs="Microsoft JhengHei"/>
-          <w:b/>
           <w:i w:val="0"/>
           <w:sz w:val="22"/>
         </w:rPr>
-        <w:t>Wayback 偏移</w:t>
-      </w:r>
-      <w:r>
-        <w:rPr>
-          <w:rFonts w:ascii="Microsoft JhengHei" w:hAnsi="Microsoft JhengHei" w:eastAsia="Microsoft JhengHei" w:cs="Microsoft JhengHei"/>
-          <w:i w:val="0"/>
-          <w:sz w:val="22"/>
-        </w:rPr>
-        <w:t>：Wayback 對地形資料常有 10–25 m 的偏移，頁面上有提醒。</w:t>
+        <w:t>右邊折線是此坡面與全區（太魯閣 5,469 個坡面）的 NDRE 逐月中位數。全區在 2024-05 也有一次短暫下降，隨即回升，屬於雲霧或季節起伏；此坡面則持續偏低。</w:t>
       </w:r>
     </w:p>
     <w:p>
@@ -1309,11 +1255,31 @@
       <w:r>
         <w:rPr>
           <w:rFonts w:ascii="Microsoft JhengHei" w:hAnsi="Microsoft JhengHei" w:eastAsia="Microsoft JhengHei" w:cs="Microsoft JhengHei"/>
-          <w:b/>
           <w:i w:val="0"/>
           <w:sz w:val="22"/>
         </w:rPr>
-        <w:t>層級數字</w:t>
+        <w:t>太魯閣沒有像高雄那樣的候選層級頁，所以講「列入人工判讀候選」，不要說「系統判為優先」。</w:t>
+      </w:r>
+    </w:p>
+    <w:p>
+      <w:pPr>
+        <w:pStyle w:val="ListBullet"/>
+      </w:pPr>
+      <w:r>
+        <w:rPr>
+          <w:rFonts w:ascii="Microsoft JhengHei" w:hAnsi="Microsoft JhengHei" w:eastAsia="Microsoft JhengHei" w:cs="Microsoft JhengHei"/>
+          <w:i w:val="0"/>
+          <w:sz w:val="22"/>
+        </w:rPr>
+        <w:t>線上：</w:t>
+      </w:r>
+      <w:r>
+        <w:rPr>
+          <w:rFonts w:ascii="Consolas" w:hAnsi="Consolas" w:eastAsia="Microsoft JhengHei" w:cs="Consolas"/>
+          <w:i w:val="0"/>
+          <w:sz w:val="20"/>
+        </w:rPr>
+        <w:t>/poc</w:t>
       </w:r>
       <w:r>
         <w:rPr>
@@ -1321,7 +1287,7 @@
           <w:i w:val="0"/>
           <w:sz w:val="22"/>
         </w:rPr>
-        <w:t>：優先 411、一般 12,105、資料不足 214（共 12,730 個有有效坡面的單元）。411 個優先中有 242 個來自 NDRE（P3），規則仍在調整（見第 5 頁）。</w:t>
+        <w:t xml:space="preserve"> 的「③ A 太魯閣」分頁，預設開啟「坡面 NDRE 持續下降」圖層（329 個坡面）與事件目錄。</w:t>
       </w:r>
     </w:p>
     <w:p>
@@ -1376,7 +1342,7 @@
           <w:i w:val="0"/>
           <w:sz w:val="24"/>
         </w:rPr>
-        <w:t>左邊是凱米颱風前後的同一個坡面，颱風後 5 天整片植被消失，紅邊指標從 0.42 掉到接近 0。我們不只做系統，也量了它準不準。影像目視與官方圖層的有無裸露一致率只有 69%；舊版近期變化訊號約四分之一屬實。我們參考水保署電子報改用紅邊指標。在高雄全區，零星的下降經盲判只有 5/26 屬實；但在大事件後，花蓮有 75%、太魯閣有 43% 的崩塌坡面被抓到，沒有事件的坡面誤報約 2%。所以紅邊指標適合大事件後快速找出植被大片消失的坡面，自動訊號只用來排出先看誰，最後一定由人確認。</w:t>
+        <w:t>我們不只做系統，也量了它準不準。影像目視與官方圖層的有無裸露一致率只有 69%；舊版近期變化訊號約四分之一屬實。我們參考水保署電子報改用紅邊指標。在高雄全區，零星的下降經盲判只有 5/26 屬實；但在大事件後，花蓮有 75%、太魯閣有 43% 的崩塌坡面被抓到，沒有事件的坡面誤報約 2%。左邊這張圖是太魯閣：崩塌占坡面不到 5% 時只抓到 7%，超過四成時抓到 93%。所以紅邊指標適合大事件後快速找出植被大片消失的坡面，自動訊號只用來排出先看誰，最後一定由人確認。</w:t>
       </w:r>
     </w:p>
     <w:p>
@@ -1913,7 +1879,7 @@
           <w:i w:val="0"/>
           <w:sz w:val="22"/>
         </w:rPr>
-        <w:t>GIF 的坡面</w:t>
+        <w:t>左邊長條圖</w:t>
       </w:r>
       <w:r>
         <w:rPr>
@@ -1921,23 +1887,7 @@
           <w:i w:val="0"/>
           <w:sz w:val="22"/>
         </w:rPr>
-        <w:t>：</w:t>
-      </w:r>
-      <w:r>
-        <w:rPr>
-          <w:rFonts w:ascii="Consolas" w:hAnsi="Consolas" w:eastAsia="Microsoft JhengHei" w:cs="Consolas"/>
-          <w:i w:val="0"/>
-          <w:sz w:val="20"/>
-        </w:rPr>
-        <w:t>SU2-11328-128399</w:t>
-      </w:r>
-      <w:r>
-        <w:rPr>
-          <w:rFonts w:ascii="Microsoft JhengHei" w:hAnsi="Microsoft JhengHei" w:eastAsia="Microsoft JhengHei" w:cs="Microsoft JhengHei"/>
-          <w:i w:val="0"/>
-          <w:sz w:val="22"/>
-        </w:rPr>
-        <w:t>，2024-07-18（颱風前）與 07-28（颱風後 5 天）的 Sentinel-2 真彩色影像（已做對比增強）。PDF 版只會顯示第一張。</w:t>
+        <w:t>：太魯閣依「事件崩塌占有效坡面的比例」分組的偵測率：&lt;5% 7%、5–10% 15%、10–20% 42%、20–40% 75%、≥40% 93%（坡面數 588、184、163、108、29）。</w:t>
       </w:r>
     </w:p>
     <w:p>
@@ -1992,7 +1942,7 @@
           <w:i w:val="0"/>
           <w:sz w:val="24"/>
         </w:rPr>
-        <w:t>最後，這套流程全用開放資料與開源工具，程式公開，高雄完成完整流程，另外四個區域也測試過衛星與事件比對。接下來請專家盲判與第一線同仁實際操作，依結果調整規則。我們不是重新發明崩塌判釋，而是把既有證據整理成可追蹤的坡面履歷：機器幫忙決定先看誰，證據鏈告訴你為什麼，最後由人決定要不要去。謝謝。</w:t>
+        <w:t>最後，這套流程全用開放資料與開源工具，程式公開，高雄完成完整流程，花蓮、太魯閣也加做了坡面紅邊檢核，另外兩區測試過衛星與事件比對。接下來請專家盲判與第一線同仁實際操作，依結果調整規則。我們不是重新發明崩塌判釋，而是把既有證據整理成可追蹤的坡面履歷：機器幫忙決定先看誰，證據鏈告訴你為什麼，最後由人決定要不要去。謝謝。</w:t>
       </w:r>
     </w:p>
     <w:p>
@@ -2089,7 +2039,23 @@
           <w:i w:val="0"/>
           <w:sz w:val="22"/>
         </w:rPr>
-        <w:t>花蓮（馬太鞍溪堰塞湖）、太魯閣（0403 地震）：Sentinel-1／2 與事件目錄比對，另做了坡面單元與 NDRE 檢核（尚未放上網站）。</w:t>
+        <w:t xml:space="preserve">花蓮（馬太鞍溪堰塞湖）、太魯閣（0403 地震）：Sentinel-1／2 與事件目錄比對，另做了坡面單元與 NDRE 檢核，結果已放上 </w:t>
+      </w:r>
+      <w:r>
+        <w:rPr>
+          <w:rFonts w:ascii="Consolas" w:hAnsi="Consolas" w:eastAsia="Microsoft JhengHei" w:cs="Consolas"/>
+          <w:i w:val="0"/>
+          <w:sz w:val="20"/>
+        </w:rPr>
+        <w:t>/poc</w:t>
+      </w:r>
+      <w:r>
+        <w:rPr>
+          <w:rFonts w:ascii="Microsoft JhengHei" w:hAnsi="Microsoft JhengHei" w:eastAsia="Microsoft JhengHei" w:cs="Microsoft JhengHei"/>
+          <w:i w:val="0"/>
+          <w:sz w:val="22"/>
+        </w:rPr>
+        <w:t xml:space="preserve"> 的花蓮、太魯閣分頁。</w:t>
       </w:r>
     </w:p>
     <w:p>
@@ -2439,33 +2405,7 @@
           <w:i w:val="0"/>
           <w:sz w:val="22"/>
         </w:rPr>
-        <w:t>確認兩件事：</w:t>
-      </w:r>
-    </w:p>
-    <w:p>
-      <w:pPr>
-        <w:pStyle w:val="ListBullet2"/>
-      </w:pPr>
-      <w:r>
-        <w:rPr>
-          <w:rFonts w:ascii="Microsoft JhengHei" w:hAnsi="Microsoft JhengHei" w:eastAsia="Microsoft JhengHei" w:cs="Microsoft JhengHei"/>
-          <w:i w:val="0"/>
-          <w:sz w:val="22"/>
-        </w:rPr>
-        <w:t>第 4 頁影片點一下能播放（mp4，H.264）。</w:t>
-      </w:r>
-    </w:p>
-    <w:p>
-      <w:pPr>
-        <w:pStyle w:val="ListBullet2"/>
-      </w:pPr>
-      <w:r>
-        <w:rPr>
-          <w:rFonts w:ascii="Microsoft JhengHei" w:hAnsi="Microsoft JhengHei" w:eastAsia="Microsoft JhengHei" w:cs="Microsoft JhengHei"/>
-          <w:i w:val="0"/>
-          <w:sz w:val="22"/>
-        </w:rPr>
-        <w:t>第 5 頁 GIF 在投影模式會自動循環。</w:t>
+        <w:t>確認第 4 頁的動態圖在投影模式會自動循環。</w:t>
       </w:r>
     </w:p>
     <w:p>
@@ -2478,7 +2418,7 @@
           <w:i w:val="0"/>
           <w:sz w:val="22"/>
         </w:rPr>
-        <w:t>PDF 版的影片與 GIF 都只顯示靜態第一格；若現場只能用 PDF，第 4 頁就照講稿口頭帶過。</w:t>
+        <w:t>PDF 版的動態圖只顯示第一格（地震前）；若現場只能用 PDF，第 4 頁口頭補一句「地震後同一處變成大片裸露」。</w:t>
       </w:r>
     </w:p>
     <w:p>

</xml_diff>

<commit_message>
Finals deck: regenerate speaker script .docx with confidence intervals
Co-Authored-By: Claude Opus 5.5 <noreply@anthropic.com>
</commit_message>
<xml_diff>
--- a/presentation/講稿與背景說明.docx
+++ b/presentation/講稿與背景說明.docx
@@ -1342,7 +1342,7 @@
           <w:i w:val="0"/>
           <w:sz w:val="24"/>
         </w:rPr>
-        <w:t>我們不只做系統，也量了它準不準。影像目視與官方圖層的有無裸露一致率只有 69%；舊版近期變化訊號約四分之一屬實。我們參考水保署電子報改用紅邊指標。在高雄全區，零星的下降經盲判只有 5/26 屬實；但在大事件後，花蓮有 75%、太魯閣有 43% 的崩塌坡面被抓到，沒有事件的坡面誤報約 2%。左邊這張圖是太魯閣：崩塌占坡面不到 5% 時只抓到 7%，超過四成時抓到 93%。所以紅邊指標適合大事件後快速找出植被大片消失的坡面，自動訊號只用來排出先看誰，最後一定由人確認。</w:t>
+        <w:t>我們不只做系統，也量了它準不準。影像目視與官方圖層的有無裸露一致率只有 69%；舊版近期變化訊號約四分之一屬實。我們參考水保署電子報改用紅邊指標。在高雄全區，零星的下降經分層盲判只有約 25% 屬實，信賴區間 5% 到 45%；但在大事件後，花蓮有 75%、太魯閣有 43% 的崩塌坡面被抓到，沒有事件的坡面誤報約 2%。左邊這張圖是太魯閣：崩塌占坡面不到 5% 時只抓到 7%，超過四成時抓到 93%。所以紅邊指標適合大事件後快速找出植被大片消失的坡面，自動訊號只用來排出先看誰，最後一定由人確認。</w:t>
       </w:r>
     </w:p>
     <w:p>
@@ -1365,14 +1365,15 @@
         <w:tblLook w:firstColumn="1" w:firstRow="1" w:lastColumn="0" w:lastRow="0" w:noHBand="0" w:noVBand="1" w:val="04A0"/>
       </w:tblPr>
       <w:tblGrid>
-        <w:gridCol w:w="3137"/>
-        <w:gridCol w:w="3137"/>
-        <w:gridCol w:w="3137"/>
+        <w:gridCol w:w="2353"/>
+        <w:gridCol w:w="2353"/>
+        <w:gridCol w:w="2353"/>
+        <w:gridCol w:w="2353"/>
       </w:tblGrid>
       <w:tr>
         <w:tc>
           <w:tcPr>
-            <w:tcW w:type="dxa" w:w="813"/>
+            <w:tcW w:type="dxa" w:w="659"/>
             <w:shd w:val="clear" w:color="auto" w:fill="2C5F2D"/>
           </w:tcPr>
           <w:p>
@@ -1395,7 +1396,7 @@
         </w:tc>
         <w:tc>
           <w:tcPr>
-            <w:tcW w:type="dxa" w:w="4647"/>
+            <w:tcW w:type="dxa" w:w="3764"/>
             <w:shd w:val="clear" w:color="auto" w:fill="2C5F2D"/>
           </w:tcPr>
           <w:p>
@@ -1418,7 +1419,7 @@
         </w:tc>
         <w:tc>
           <w:tcPr>
-            <w:tcW w:type="dxa" w:w="3950"/>
+            <w:tcW w:type="dxa" w:w="3388"/>
             <w:shd w:val="clear" w:color="auto" w:fill="2C5F2D"/>
           </w:tcPr>
           <w:p>
@@ -1439,11 +1440,34 @@
             </w:r>
           </w:p>
         </w:tc>
+        <w:tc>
+          <w:tcPr>
+            <w:tcW w:type="dxa" w:w="1600"/>
+            <w:shd w:val="clear" w:color="auto" w:fill="2C5F2D"/>
+          </w:tcPr>
+          <w:p>
+            <w:r>
+              <w:rPr>
+                <w:b/>
+              </w:rPr>
+            </w:r>
+            <w:r>
+              <w:rPr>
+                <w:rFonts w:ascii="Microsoft JhengHei" w:hAnsi="Microsoft JhengHei" w:eastAsia="Microsoft JhengHei" w:cs="Microsoft JhengHei"/>
+                <w:b/>
+                <w:i w:val="0"/>
+                <w:color w:val="FFFFFF"/>
+                <w:sz w:val="20"/>
+              </w:rPr>
+              <w:t>95% 信賴區間</w:t>
+            </w:r>
+          </w:p>
+        </w:tc>
       </w:tr>
       <w:tr>
         <w:tc>
           <w:tcPr>
-            <w:tcW w:type="dxa" w:w="813"/>
+            <w:tcW w:type="dxa" w:w="659"/>
           </w:tcPr>
           <w:p>
             <w:r/>
@@ -1459,7 +1483,7 @@
         </w:tc>
         <w:tc>
           <w:tcPr>
-            <w:tcW w:type="dxa" w:w="4647"/>
+            <w:tcW w:type="dxa" w:w="3764"/>
           </w:tcPr>
           <w:p>
             <w:r/>
@@ -1475,7 +1499,7 @@
         </w:tc>
         <w:tc>
           <w:tcPr>
-            <w:tcW w:type="dxa" w:w="3950"/>
+            <w:tcW w:type="dxa" w:w="3388"/>
           </w:tcPr>
           <w:p>
             <w:r/>
@@ -1485,7 +1509,23 @@
                 <w:i w:val="0"/>
                 <w:sz w:val="20"/>
               </w:rPr>
-              <w:t>30 個坡面盲測，29 個可判讀；類別嚴格一致只有 28%</w:t>
+              <w:t>30 個坡面盲測，29 個可判讀（20/29）；類別嚴格一致只有 28%</w:t>
+            </w:r>
+          </w:p>
+        </w:tc>
+        <w:tc>
+          <w:tcPr>
+            <w:tcW w:type="dxa" w:w="1600"/>
+          </w:tcPr>
+          <w:p>
+            <w:r/>
+            <w:r>
+              <w:rPr>
+                <w:rFonts w:ascii="Microsoft JhengHei" w:hAnsi="Microsoft JhengHei" w:eastAsia="Microsoft JhengHei" w:cs="Microsoft JhengHei"/>
+                <w:i w:val="0"/>
+                <w:sz w:val="20"/>
+              </w:rPr>
+              <w:t>51–83%</w:t>
             </w:r>
           </w:p>
         </w:tc>
@@ -1493,7 +1533,7 @@
       <w:tr>
         <w:tc>
           <w:tcPr>
-            <w:tcW w:type="dxa" w:w="813"/>
+            <w:tcW w:type="dxa" w:w="659"/>
           </w:tcPr>
           <w:p>
             <w:r/>
@@ -1509,7 +1549,7 @@
         </w:tc>
         <w:tc>
           <w:tcPr>
-            <w:tcW w:type="dxa" w:w="4647"/>
+            <w:tcW w:type="dxa" w:w="3764"/>
           </w:tcPr>
           <w:p>
             <w:r/>
@@ -1525,7 +1565,7 @@
         </w:tc>
         <w:tc>
           <w:tcPr>
-            <w:tcW w:type="dxa" w:w="3950"/>
+            <w:tcW w:type="dxa" w:w="3388"/>
           </w:tcPr>
           <w:p>
             <w:r/>
@@ -1535,15 +1575,13 @@
                 <w:i w:val="0"/>
                 <w:sz w:val="20"/>
               </w:rPr>
-              <w:t>24 個分層抽樣坡面的人工判讀（舊版 v1 單元）</w:t>
+              <w:t>24 個分層坡面驗證中的 S1 層（1/4，舊版 v1 單元）</w:t>
             </w:r>
           </w:p>
         </w:tc>
-      </w:tr>
-      <w:tr>
         <w:tc>
           <w:tcPr>
-            <w:tcW w:type="dxa" w:w="813"/>
+            <w:tcW w:type="dxa" w:w="1600"/>
           </w:tcPr>
           <w:p>
             <w:r/>
@@ -1553,13 +1591,15 @@
                 <w:i w:val="0"/>
                 <w:sz w:val="20"/>
               </w:rPr>
-              <w:t>5/26</w:t>
+              <w:t>5–70%</w:t>
             </w:r>
           </w:p>
         </w:tc>
+      </w:tr>
+      <w:tr>
         <w:tc>
           <w:tcPr>
-            <w:tcW w:type="dxa" w:w="4647"/>
+            <w:tcW w:type="dxa" w:w="659"/>
           </w:tcPr>
           <w:p>
             <w:r/>
@@ -1569,13 +1609,13 @@
                 <w:i w:val="0"/>
                 <w:sz w:val="20"/>
               </w:rPr>
-              <w:t>高雄全區 NDRE「持續下降」的坡面，人工看前後影像確認有新增或擴大裸露的比例（19%）</w:t>
+              <w:t>約 25%</w:t>
             </w:r>
           </w:p>
         </w:tc>
         <w:tc>
           <w:tcPr>
-            <w:tcW w:type="dxa" w:w="3950"/>
+            <w:tcW w:type="dxa" w:w="3764"/>
           </w:tcPr>
           <w:p>
             <w:r/>
@@ -1585,7 +1625,39 @@
                 <w:i w:val="0"/>
                 <w:sz w:val="20"/>
               </w:rPr>
-              <w:t>32 個坡面分層盲判（26 個下降＋6 個對照）；對照組也有 1/6</w:t>
+              <w:t>高雄全區 NDRE「持續下降」的坡面，人工看前後影像確認有新增或擴大裸露的比例</w:t>
+            </w:r>
+          </w:p>
+        </w:tc>
+        <w:tc>
+          <w:tcPr>
+            <w:tcW w:type="dxa" w:w="3388"/>
+          </w:tcPr>
+          <w:p>
+            <w:r/>
+            <w:r>
+              <w:rPr>
+                <w:rFonts w:ascii="Microsoft JhengHei" w:hAnsi="Microsoft JhengHei" w:eastAsia="Microsoft JhengHei" w:cs="Microsoft JhengHei"/>
+                <w:i w:val="0"/>
+                <w:sz w:val="20"/>
+              </w:rPr>
+              <w:t>26 個下降坡面分層盲判（5/26），依各層母體數加權；對照組 1/6</w:t>
+            </w:r>
+          </w:p>
+        </w:tc>
+        <w:tc>
+          <w:tcPr>
+            <w:tcW w:type="dxa" w:w="1600"/>
+          </w:tcPr>
+          <w:p>
+            <w:r/>
+            <w:r>
+              <w:rPr>
+                <w:rFonts w:ascii="Microsoft JhengHei" w:hAnsi="Microsoft JhengHei" w:eastAsia="Microsoft JhengHei" w:cs="Microsoft JhengHei"/>
+                <w:i w:val="0"/>
+                <w:sz w:val="20"/>
+              </w:rPr>
+              <w:t>5–45%（對照組 3–56%）</w:t>
             </w:r>
           </w:p>
         </w:tc>
@@ -1593,7 +1665,7 @@
       <w:tr>
         <w:tc>
           <w:tcPr>
-            <w:tcW w:type="dxa" w:w="813"/>
+            <w:tcW w:type="dxa" w:w="659"/>
           </w:tcPr>
           <w:p>
             <w:r/>
@@ -1609,7 +1681,7 @@
         </w:tc>
         <w:tc>
           <w:tcPr>
-            <w:tcW w:type="dxa" w:w="4647"/>
+            <w:tcW w:type="dxa" w:w="3764"/>
           </w:tcPr>
           <w:p>
             <w:r/>
@@ -1625,7 +1697,7 @@
         </w:tc>
         <w:tc>
           <w:tcPr>
-            <w:tcW w:type="dxa" w:w="3950"/>
+            <w:tcW w:type="dxa" w:w="3388"/>
           </w:tcPr>
           <w:p>
             <w:r/>
@@ -1651,7 +1723,23 @@
                 <w:i w:val="0"/>
                 <w:sz w:val="20"/>
               </w:rPr>
-              <w:t xml:space="preserve"> 各區的事件目錄比對</w:t>
+              <w:t xml:space="preserve"> 各區的事件目錄全數比對</w:t>
+            </w:r>
+          </w:p>
+        </w:tc>
+        <w:tc>
+          <w:tcPr>
+            <w:tcW w:type="dxa" w:w="1600"/>
+          </w:tcPr>
+          <w:p>
+            <w:r/>
+            <w:r>
+              <w:rPr>
+                <w:rFonts w:ascii="Microsoft JhengHei" w:hAnsi="Microsoft JhengHei" w:eastAsia="Microsoft JhengHei" w:cs="Microsoft JhengHei"/>
+                <w:i w:val="0"/>
+                <w:sz w:val="20"/>
+              </w:rPr>
+              <w:t>66–83%、38–48%</w:t>
             </w:r>
           </w:p>
         </w:tc>
@@ -1659,7 +1747,7 @@
       <w:tr>
         <w:tc>
           <w:tcPr>
-            <w:tcW w:type="dxa" w:w="813"/>
+            <w:tcW w:type="dxa" w:w="659"/>
           </w:tcPr>
           <w:p>
             <w:r/>
@@ -1675,7 +1763,7 @@
         </w:tc>
         <w:tc>
           <w:tcPr>
-            <w:tcW w:type="dxa" w:w="4647"/>
+            <w:tcW w:type="dxa" w:w="3764"/>
           </w:tcPr>
           <w:p>
             <w:r/>
@@ -1685,13 +1773,13 @@
                 <w:i w:val="0"/>
                 <w:sz w:val="20"/>
               </w:rPr>
-              <w:t>沒有任何事件崩塌的坡面被判下降的比例（花蓮 1.9%、太魯閣 2.0%）</w:t>
+              <w:t>沒有任何事件崩塌的坡面被判下降的比例（花蓮 123/6,450、太魯閣 85/4,354）</w:t>
             </w:r>
           </w:p>
         </w:tc>
         <w:tc>
           <w:tcPr>
-            <w:tcW w:type="dxa" w:w="3950"/>
+            <w:tcW w:type="dxa" w:w="3388"/>
           </w:tcPr>
           <w:p>
             <w:r/>
@@ -1702,6 +1790,22 @@
                 <w:sz w:val="20"/>
               </w:rPr>
               <w:t>同上</w:t>
+            </w:r>
+          </w:p>
+        </w:tc>
+        <w:tc>
+          <w:tcPr>
+            <w:tcW w:type="dxa" w:w="1600"/>
+          </w:tcPr>
+          <w:p>
+            <w:r/>
+            <w:r>
+              <w:rPr>
+                <w:rFonts w:ascii="Microsoft JhengHei" w:hAnsi="Microsoft JhengHei" w:eastAsia="Microsoft JhengHei" w:cs="Microsoft JhengHei"/>
+                <w:i w:val="0"/>
+                <w:sz w:val="20"/>
+              </w:rPr>
+              <w:t>1.6–2.3%、1.6–2.4%</w:t>
             </w:r>
           </w:p>
         </w:tc>
@@ -1717,6 +1821,44 @@
           <w:sz w:val="22"/>
         </w:rPr>
         <w:t>背景</w:t>
+      </w:r>
+    </w:p>
+    <w:p>
+      <w:pPr>
+        <w:pStyle w:val="ListBullet"/>
+      </w:pPr>
+      <w:r>
+        <w:rPr>
+          <w:rFonts w:ascii="Microsoft JhengHei" w:hAnsi="Microsoft JhengHei" w:eastAsia="Microsoft JhengHei" w:cs="Microsoft JhengHei"/>
+          <w:b/>
+          <w:i w:val="0"/>
+          <w:sz w:val="22"/>
+        </w:rPr>
+        <w:t>信賴區間怎麼算</w:t>
+      </w:r>
+      <w:r>
+        <w:rPr>
+          <w:rFonts w:ascii="Microsoft JhengHei" w:hAnsi="Microsoft JhengHei" w:eastAsia="Microsoft JhengHei" w:cs="Microsoft JhengHei"/>
+          <w:i w:val="0"/>
+          <w:sz w:val="22"/>
+        </w:rPr>
+        <w:t>：比例用 Wilson 區間；高雄 NDRE 的 25% 是分層抽樣估計（各層屬實比例依該層母體數加權：官方期間有裸露 56 個、無裸露 22 個、官方之後 112 個），方法參考 Olofsson et al. (2014)、Stehman (2014)。花蓮、太魯閣是全數比對，區間表示「換一場類似事件時」的不確定性。樣本小，區間只當量級參考（</w:t>
+      </w:r>
+      <w:r>
+        <w:rPr>
+          <w:rFonts w:ascii="Consolas" w:hAnsi="Consolas" w:eastAsia="Microsoft JhengHei" w:cs="Consolas"/>
+          <w:i w:val="0"/>
+          <w:sz w:val="20"/>
+        </w:rPr>
+        <w:t>scripts/accuracy_ci.py</w:t>
+      </w:r>
+      <w:r>
+        <w:rPr>
+          <w:rFonts w:ascii="Microsoft JhengHei" w:hAnsi="Microsoft JhengHei" w:eastAsia="Microsoft JhengHei" w:cs="Microsoft JhengHei"/>
+          <w:i w:val="0"/>
+          <w:sz w:val="22"/>
+        </w:rPr>
+        <w:t>）。</w:t>
       </w:r>
     </w:p>
     <w:p>
@@ -1796,7 +1938,7 @@
           <w:i w:val="0"/>
           <w:sz w:val="22"/>
         </w:rPr>
-        <w:t>為什麼高雄只有 2 成、大事件區卻很高</w:t>
+        <w:t>為什麼高雄只有約 25%、大事件區卻很高</w:t>
       </w:r>
       <w:r>
         <w:rPr>
@@ -2186,7 +2328,7 @@
           <w:i w:val="0"/>
           <w:sz w:val="22"/>
         </w:rPr>
-        <w:t>水保署已經有專業判釋的事件目錄，我們的價值是把分散的證據整理到同一個坡面上，幫助決定先看哪裡。我們實測過自動訊號的準確度：零星變化只有約 2 成屬實，所以只用來排序，不用來判定。</w:t>
+        <w:t>水保署已經有專業判釋的事件目錄，我們的價值是把分散的證據整理到同一個坡面上，幫助決定先看哪裡。我們實測過自動訊號的準確度：零星變化經分層盲判只有約 25% 屬實，所以只用來排序，不用來判定。</w:t>
       </w:r>
     </w:p>
     <w:p>
@@ -2218,7 +2360,7 @@
           <w:i w:val="0"/>
           <w:sz w:val="22"/>
         </w:rPr>
-        <w:t>Q：NDRE 只有 2 成準，為什麼還要用？</w:t>
+        <w:t>Q：NDRE 只有約 25% 準，為什麼還要用？</w:t>
       </w:r>
     </w:p>
     <w:p>

</xml_diff>

<commit_message>
Roadmap page, OSM road/settlement exposure, coarse per-stratum landslide density, backup slides 7-8
- su_osm_exposure.py: per-slope road length, buildings and nearest settlement (Geofabrik OSM extract, ODbL); /su evidence page block 5, does not change tiers
- geology_landslide_density.py: public small-scale strata x effective slope x 2021-2024 annual landslide layers; density and frequency ratio per stratum
- /roadmap: expert six-module vision vs current state, exposure summary, geology table; nav links from /, /poc, /su
- Deck: backup slides 7 (vision mapping) and 8 (strata density); script and docx updated; ARCHITECTURE appendix 19

Co-Authored-By: Claude Opus 5.5 <noreply@anthropic.com>
</commit_message>
<xml_diff>
--- a/presentation/講稿與背景說明.docx
+++ b/presentation/講稿與背景說明.docx
@@ -2307,6 +2307,418 @@
           <w:color w:val="2C5F2D"/>
           <w:sz w:val="30"/>
         </w:rPr>
+        <w:t>第 7 頁（備用）　對照崩塌智慧防災構想：現在在哪、下一步</w:t>
+      </w:r>
+    </w:p>
+    <w:p>
+      <w:r>
+        <w:rPr>
+          <w:rFonts w:ascii="Microsoft JhengHei" w:hAnsi="Microsoft JhengHei" w:eastAsia="Microsoft JhengHei" w:cs="Microsoft JhengHei"/>
+          <w:i w:val="0"/>
+          <w:sz w:val="22"/>
+        </w:rPr>
+        <w:t>不在 5 分鐘主線；評審問到「系統藍圖」「下一步」「地質」「道路聚落」時再翻。</w:t>
+      </w:r>
+    </w:p>
+    <w:p>
+      <w:r>
+        <w:rPr>
+          <w:rFonts w:ascii="Microsoft JhengHei" w:hAnsi="Microsoft JhengHei" w:eastAsia="Microsoft JhengHei" w:cs="Microsoft JhengHei"/>
+          <w:b/>
+          <w:i w:val="0"/>
+          <w:sz w:val="22"/>
+        </w:rPr>
+        <w:t>講稿</w:t>
+      </w:r>
+    </w:p>
+    <w:p>
+      <w:pPr>
+        <w:pBdr>
+          <w:left w:val="single" w:sz="18" w:space="8" w:color="2C5F2D"/>
+        </w:pBdr>
+        <w:ind w:left="227"/>
+      </w:pPr>
+      <w:r>
+        <w:rPr>
+          <w:rFonts w:ascii="Microsoft JhengHei" w:hAnsi="Microsoft JhengHei" w:eastAsia="Microsoft JhengHei" w:cs="Microsoft JhengHei"/>
+          <w:i w:val="0"/>
+          <w:sz w:val="24"/>
+        </w:rPr>
+        <w:t>專家提出的崩塌智慧防災平台有六個模組。我們目前做到的是平時篩查：坡地底圖、多源監測和 AI 輔助判釋都有一部分，其中道路與建物暴露是用 OpenStreetMap 疊合，回答坡面崩了會碰到什麼，但不改候選層級。地質目前只拿到影像圖磚，五萬分之一的斷層、位態、順向坡要取得向量後才能分析。降雨觸發、下游災害鏈和應變工作流還沒做，這是從平時篩查走向事件反應的下一步。</w:t>
+      </w:r>
+    </w:p>
+    <w:p>
+      <w:r>
+        <w:rPr>
+          <w:rFonts w:ascii="Microsoft JhengHei" w:hAnsi="Microsoft JhengHei" w:eastAsia="Microsoft JhengHei" w:cs="Microsoft JhengHei"/>
+          <w:b/>
+          <w:i w:val="0"/>
+          <w:sz w:val="22"/>
+        </w:rPr>
+        <w:t>背景</w:t>
+      </w:r>
+    </w:p>
+    <w:p>
+      <w:pPr>
+        <w:pStyle w:val="ListBullet"/>
+      </w:pPr>
+      <w:r>
+        <w:rPr>
+          <w:rFonts w:ascii="Microsoft JhengHei" w:hAnsi="Microsoft JhengHei" w:eastAsia="Microsoft JhengHei" w:cs="Microsoft JhengHei"/>
+          <w:b/>
+          <w:i w:val="0"/>
+          <w:sz w:val="22"/>
+        </w:rPr>
+        <w:t>OSM 道路與聚落</w:t>
+      </w:r>
+      <w:r>
+        <w:rPr>
+          <w:rFonts w:ascii="Microsoft JhengHei" w:hAnsi="Microsoft JhengHei" w:eastAsia="Microsoft JhengHei" w:cs="Microsoft JhengHei"/>
+          <w:i w:val="0"/>
+          <w:sz w:val="22"/>
+        </w:rPr>
+        <w:t xml:space="preserve">：Geofabrik 臺灣 OSM 擷取（2026-10-25），高雄 POC 內道路 6,994 段、建物 1,760 棟、聚落點 208 個。每個坡面計算坡面內與外推 100 m 的道路長度、建物數、最近聚落，放在 </w:t>
+      </w:r>
+      <w:r>
+        <w:rPr>
+          <w:rFonts w:ascii="Consolas" w:hAnsi="Consolas" w:eastAsia="Microsoft JhengHei" w:cs="Consolas"/>
+          <w:i w:val="0"/>
+          <w:sz w:val="20"/>
+        </w:rPr>
+        <w:t>/su</w:t>
+      </w:r>
+      <w:r>
+        <w:rPr>
+          <w:rFonts w:ascii="Microsoft JhengHei" w:hAnsi="Microsoft JhengHei" w:eastAsia="Microsoft JhengHei" w:cs="Microsoft JhengHei"/>
+          <w:i w:val="0"/>
+          <w:sz w:val="22"/>
+        </w:rPr>
+        <w:t xml:space="preserve"> 證據頁第⑤區塊，標示「© OpenStreetMap contributors」（ODbL）。</w:t>
+      </w:r>
+    </w:p>
+    <w:p>
+      <w:pPr>
+        <w:pStyle w:val="ListBullet2"/>
+      </w:pPr>
+      <w:r>
+        <w:rPr>
+          <w:rFonts w:ascii="Microsoft JhengHei" w:hAnsi="Microsoft JhengHei" w:eastAsia="Microsoft JhengHei" w:cs="Microsoft JhengHei"/>
+          <w:i w:val="0"/>
+          <w:sz w:val="22"/>
+        </w:rPr>
+        <w:t>411 個優先人工判讀坡面中，200 個外推 100 m 內有道路（其中 106 個是主要或一般道路），25 個有建物。</w:t>
+      </w:r>
+    </w:p>
+    <w:p>
+      <w:pPr>
+        <w:pStyle w:val="ListBullet2"/>
+      </w:pPr>
+      <w:r>
+        <w:rPr>
+          <w:rFonts w:ascii="Microsoft JhengHei" w:hAnsi="Microsoft JhengHei" w:eastAsia="Microsoft JhengHei" w:cs="Microsoft JhengHei"/>
+          <w:i w:val="0"/>
+          <w:sz w:val="22"/>
+        </w:rPr>
+        <w:t>OSM 由志工繪製，山區建物與產業道路常缺漏，數字是「至少有這些」。</w:t>
+      </w:r>
+    </w:p>
+    <w:p>
+      <w:pPr>
+        <w:pStyle w:val="ListBullet"/>
+      </w:pPr>
+      <w:r>
+        <w:rPr>
+          <w:rFonts w:ascii="Microsoft JhengHei" w:hAnsi="Microsoft JhengHei" w:eastAsia="Microsoft JhengHei" w:cs="Microsoft JhengHei"/>
+          <w:b/>
+          <w:i w:val="0"/>
+          <w:sz w:val="22"/>
+        </w:rPr>
+        <w:t>地質</w:t>
+      </w:r>
+      <w:r>
+        <w:rPr>
+          <w:rFonts w:ascii="Microsoft JhengHei" w:hAnsi="Microsoft JhengHei" w:eastAsia="Microsoft JhengHei" w:cs="Microsoft JhengHei"/>
+          <w:i w:val="0"/>
+          <w:sz w:val="22"/>
+        </w:rPr>
+        <w:t>：BigGIS 的「地礦中心地質圖（五萬分之一）」是地礦中心的影像圖磚，不是向量；公開可下載的只有全臺地層面（小比例尺，約 1,600 個多邊形，沒有斷層與位態），已用來做第 8 頁的各地層崩塌密度。斷層緩衝、順向坡判釋需要五萬分之一向量，要向水保署或地礦中心申請。</w:t>
+      </w:r>
+    </w:p>
+    <w:p>
+      <w:pPr>
+        <w:pStyle w:val="ListBullet"/>
+      </w:pPr>
+      <w:r>
+        <w:rPr>
+          <w:rFonts w:ascii="Microsoft JhengHei" w:hAnsi="Microsoft JhengHei" w:eastAsia="Microsoft JhengHei" w:cs="Microsoft JhengHei"/>
+          <w:b/>
+          <w:i w:val="0"/>
+          <w:sz w:val="22"/>
+        </w:rPr>
+        <w:t>網站</w:t>
+      </w:r>
+      <w:r>
+        <w:rPr>
+          <w:rFonts w:ascii="Microsoft JhengHei" w:hAnsi="Microsoft JhengHei" w:eastAsia="Microsoft JhengHei" w:cs="Microsoft JhengHei"/>
+          <w:i w:val="0"/>
+          <w:sz w:val="22"/>
+        </w:rPr>
+        <w:t xml:space="preserve">：這頁的對照表放在 </w:t>
+      </w:r>
+      <w:r>
+        <w:rPr>
+          <w:rFonts w:ascii="Consolas" w:hAnsi="Consolas" w:eastAsia="Microsoft JhengHei" w:cs="Consolas"/>
+          <w:i w:val="0"/>
+          <w:sz w:val="20"/>
+        </w:rPr>
+        <w:t>/roadmap</w:t>
+      </w:r>
+      <w:r>
+        <w:rPr>
+          <w:rFonts w:ascii="Microsoft JhengHei" w:hAnsi="Microsoft JhengHei" w:eastAsia="Microsoft JhengHei" w:cs="Microsoft JhengHei"/>
+          <w:i w:val="0"/>
+          <w:sz w:val="22"/>
+        </w:rPr>
+        <w:t>（系統藍圖對照），含道路聚落暴露摘要與各地層崩塌密度表。</w:t>
+      </w:r>
+    </w:p>
+    <w:p>
+      <w:pPr>
+        <w:pStyle w:val="ListBullet"/>
+      </w:pPr>
+      <w:r>
+        <w:rPr>
+          <w:rFonts w:ascii="Microsoft JhengHei" w:hAnsi="Microsoft JhengHei" w:eastAsia="Microsoft JhengHei" w:cs="Microsoft JhengHei"/>
+          <w:b/>
+          <w:i w:val="0"/>
+          <w:sz w:val="22"/>
+        </w:rPr>
+        <w:t>OSM 有沒有崩塌地圖層</w:t>
+      </w:r>
+      <w:r>
+        <w:rPr>
+          <w:rFonts w:ascii="Microsoft JhengHei" w:hAnsi="Microsoft JhengHei" w:eastAsia="Microsoft JhengHei" w:cs="Microsoft JhengHei"/>
+          <w:i w:val="0"/>
+          <w:sz w:val="22"/>
+        </w:rPr>
+        <w:t xml:space="preserve">：幾乎沒有。臺灣 </w:t>
+      </w:r>
+      <w:r>
+        <w:rPr>
+          <w:rFonts w:ascii="Consolas" w:hAnsi="Consolas" w:eastAsia="Microsoft JhengHei" w:cs="Consolas"/>
+          <w:i w:val="0"/>
+          <w:sz w:val="20"/>
+        </w:rPr>
+        <w:t>natural=landslide</w:t>
+      </w:r>
+      <w:r>
+        <w:rPr>
+          <w:rFonts w:ascii="Microsoft JhengHei" w:hAnsi="Microsoft JhengHei" w:eastAsia="Microsoft JhengHei" w:cs="Microsoft JhengHei"/>
+          <w:i w:val="0"/>
+          <w:sz w:val="22"/>
+        </w:rPr>
+        <w:t xml:space="preserve"> 0 筆、</w:t>
+      </w:r>
+      <w:r>
+        <w:rPr>
+          <w:rFonts w:ascii="Consolas" w:hAnsi="Consolas" w:eastAsia="Microsoft JhengHei" w:cs="Consolas"/>
+          <w:i w:val="0"/>
+          <w:sz w:val="20"/>
+        </w:rPr>
+        <w:t>hazard=landslide</w:t>
+      </w:r>
+      <w:r>
+        <w:rPr>
+          <w:rFonts w:ascii="Microsoft JhengHei" w:hAnsi="Microsoft JhengHei" w:eastAsia="Microsoft JhengHei" w:cs="Microsoft JhengHei"/>
+          <w:i w:val="0"/>
+          <w:sz w:val="22"/>
+        </w:rPr>
+        <w:t xml:space="preserve"> 1 筆；碎石坡、裸岩約 2,300 筆，沒有日期與事件，不適合當崩塌資料，所以崩塌仍用水保署官方圖層。</w:t>
+      </w:r>
+    </w:p>
+    <w:p>
+      <w:pPr>
+        <w:pBdr>
+          <w:bottom w:val="single" w:sz="6" w:space="1" w:color="C8D3CA"/>
+        </w:pBdr>
+      </w:pPr>
+    </w:p>
+    <w:p>
+      <w:pPr>
+        <w:pStyle w:val="Heading1"/>
+        <w:spacing w:before="280"/>
+      </w:pPr>
+      <w:r>
+        <w:rPr>
+          <w:b/>
+        </w:rPr>
+      </w:r>
+      <w:r>
+        <w:rPr>
+          <w:rFonts w:ascii="Microsoft JhengHei" w:hAnsi="Microsoft JhengHei" w:eastAsia="Microsoft JhengHei" w:cs="Microsoft JhengHei"/>
+          <w:b/>
+          <w:i w:val="0"/>
+          <w:color w:val="2C5F2D"/>
+          <w:sz w:val="30"/>
+        </w:rPr>
+        <w:t>第 8 頁（備用）　地質：哪些地層比較容易崩（粗尺度）</w:t>
+      </w:r>
+    </w:p>
+    <w:p>
+      <w:r>
+        <w:rPr>
+          <w:rFonts w:ascii="Microsoft JhengHei" w:hAnsi="Microsoft JhengHei" w:eastAsia="Microsoft JhengHei" w:cs="Microsoft JhengHei"/>
+          <w:i w:val="0"/>
+          <w:sz w:val="22"/>
+        </w:rPr>
+        <w:t>評審問到地質、岩性、為什麼某些區域特別容易崩時再翻。</w:t>
+      </w:r>
+    </w:p>
+    <w:p>
+      <w:r>
+        <w:rPr>
+          <w:rFonts w:ascii="Microsoft JhengHei" w:hAnsi="Microsoft JhengHei" w:eastAsia="Microsoft JhengHei" w:cs="Microsoft JhengHei"/>
+          <w:b/>
+          <w:i w:val="0"/>
+          <w:sz w:val="22"/>
+        </w:rPr>
+        <w:t>講稿</w:t>
+      </w:r>
+    </w:p>
+    <w:p>
+      <w:pPr>
+        <w:pBdr>
+          <w:left w:val="single" w:sz="18" w:space="8" w:color="2C5F2D"/>
+        </w:pBdr>
+        <w:ind w:left="227"/>
+      </w:pPr>
+      <w:r>
+        <w:rPr>
+          <w:rFonts w:ascii="Microsoft JhengHei" w:hAnsi="Microsoft JhengHei" w:eastAsia="Microsoft JhengHei" w:cs="Microsoft JhengHei"/>
+          <w:i w:val="0"/>
+          <w:sz w:val="24"/>
+        </w:rPr>
+        <w:t>我們用 BigGIS 引用的公開地層圖，疊上 2021 到 2024 年的年度崩塌圖層，以坡度 15 度以上的有效坡面當分母，算每個地層的崩塌密度。全區約 5.3%；始新世的西村層，也就是板岩，8.1%，是平均的 1.5 倍；上新世的錦水頁岩只有 1.7%。紅邊下降的比例在幾個主要地層都約 2%，差異不大。限制是這份地層圖比例尺小，沒有斷層和位態，只能做描述性統計；斷層距離和順向坡要取得五萬分之一的向量才能分析。</w:t>
+      </w:r>
+    </w:p>
+    <w:p>
+      <w:r>
+        <w:rPr>
+          <w:rFonts w:ascii="Microsoft JhengHei" w:hAnsi="Microsoft JhengHei" w:eastAsia="Microsoft JhengHei" w:cs="Microsoft JhengHei"/>
+          <w:b/>
+          <w:i w:val="0"/>
+          <w:sz w:val="22"/>
+        </w:rPr>
+        <w:t>背景</w:t>
+      </w:r>
+    </w:p>
+    <w:p>
+      <w:pPr>
+        <w:pStyle w:val="ListBullet"/>
+      </w:pPr>
+      <w:r>
+        <w:rPr>
+          <w:rFonts w:ascii="Microsoft JhengHei" w:hAnsi="Microsoft JhengHei" w:eastAsia="Microsoft JhengHei" w:cs="Microsoft JhengHei"/>
+          <w:b/>
+          <w:i w:val="0"/>
+          <w:sz w:val="22"/>
+        </w:rPr>
+        <w:t>方法</w:t>
+      </w:r>
+      <w:r>
+        <w:rPr>
+          <w:rFonts w:ascii="Microsoft JhengHei" w:hAnsi="Microsoft JhengHei" w:eastAsia="Microsoft JhengHei" w:cs="Microsoft JhengHei"/>
+          <w:i w:val="0"/>
+          <w:sz w:val="22"/>
+        </w:rPr>
+        <w:t>（</w:t>
+      </w:r>
+      <w:r>
+        <w:rPr>
+          <w:rFonts w:ascii="Consolas" w:hAnsi="Consolas" w:eastAsia="Microsoft JhengHei" w:cs="Consolas"/>
+          <w:i w:val="0"/>
+          <w:sz w:val="20"/>
+        </w:rPr>
+        <w:t>scripts/geology_landslide_density.py</w:t>
+      </w:r>
+      <w:r>
+        <w:rPr>
+          <w:rFonts w:ascii="Microsoft JhengHei" w:hAnsi="Microsoft JhengHei" w:eastAsia="Microsoft JhengHei" w:cs="Microsoft JhengHei"/>
+          <w:i w:val="0"/>
+          <w:sz w:val="22"/>
+        </w:rPr>
+        <w:t>）：地層面與 SUv2 有效坡面（≥15°）相交；崩塌＝110–113 年度全臺崩塌地圖層（2021–2024）聯集；崩塌密度＝崩塌面積 ÷ 有效坡面面積；頻率比 FR＝地層密度 ÷ 全區密度。NDRE 下降坡面依坡面代表點歸到地層。</w:t>
+      </w:r>
+    </w:p>
+    <w:p>
+      <w:pPr>
+        <w:pStyle w:val="ListBullet"/>
+      </w:pPr>
+      <w:r>
+        <w:rPr>
+          <w:rFonts w:ascii="Microsoft JhengHei" w:hAnsi="Microsoft JhengHei" w:eastAsia="Microsoft JhengHei" w:cs="Microsoft JhengHei"/>
+          <w:b/>
+          <w:i w:val="0"/>
+          <w:sz w:val="22"/>
+        </w:rPr>
+        <w:t>數字</w:t>
+      </w:r>
+      <w:r>
+        <w:rPr>
+          <w:rFonts w:ascii="Microsoft JhengHei" w:hAnsi="Microsoft JhengHei" w:eastAsia="Microsoft JhengHei" w:cs="Microsoft JhengHei"/>
+          <w:i w:val="0"/>
+          <w:sz w:val="22"/>
+        </w:rPr>
+        <w:t>：有效坡面 1,718 km²、崩塌 9,147 ha（5.3%）。三峽群（Ms）643 km²、FR 0.57；西村層（Eh）542 km²、FR 1.53；廬山層（Ml）409 km²、FR 1.08；錦水頁岩（P1）51 km²、FR 0.32。有效坡面 &lt;2 km² 的地層不列。</w:t>
+      </w:r>
+    </w:p>
+    <w:p>
+      <w:pPr>
+        <w:pStyle w:val="ListBullet"/>
+      </w:pPr>
+      <w:r>
+        <w:rPr>
+          <w:rFonts w:ascii="Microsoft JhengHei" w:hAnsi="Microsoft JhengHei" w:eastAsia="Microsoft JhengHei" w:cs="Microsoft JhengHei"/>
+          <w:b/>
+          <w:i w:val="0"/>
+          <w:sz w:val="22"/>
+        </w:rPr>
+        <w:t>不能說的</w:t>
+      </w:r>
+      <w:r>
+        <w:rPr>
+          <w:rFonts w:ascii="Microsoft JhengHei" w:hAnsi="Microsoft JhengHei" w:eastAsia="Microsoft JhengHei" w:cs="Microsoft JhengHei"/>
+          <w:i w:val="0"/>
+          <w:sz w:val="22"/>
+        </w:rPr>
+        <w:t>：這不是敏感度模型，也沒有控制坡度、降雨、距河道等因子；西村層 FR 高可能也反映它分布在較高、較陡、雨量較多的山區。</w:t>
+      </w:r>
+    </w:p>
+    <w:p>
+      <w:pPr>
+        <w:pBdr>
+          <w:bottom w:val="single" w:sz="6" w:space="1" w:color="C8D3CA"/>
+        </w:pBdr>
+      </w:pPr>
+    </w:p>
+    <w:p>
+      <w:pPr>
+        <w:pStyle w:val="Heading1"/>
+        <w:spacing w:before="280"/>
+      </w:pPr>
+      <w:r>
+        <w:rPr>
+          <w:b/>
+        </w:rPr>
+      </w:r>
+      <w:r>
+        <w:rPr>
+          <w:rFonts w:ascii="Microsoft JhengHei" w:hAnsi="Microsoft JhengHei" w:eastAsia="Microsoft JhengHei" w:cs="Microsoft JhengHei"/>
+          <w:b/>
+          <w:i w:val="0"/>
+          <w:color w:val="2C5F2D"/>
+          <w:sz w:val="30"/>
+        </w:rPr>
         <w:t>評審可能的提問</w:t>
       </w:r>
     </w:p>
@@ -2455,6 +2867,48 @@
           <w:sz w:val="22"/>
         </w:rPr>
         <w:t>Wayback 不是正射對位的時間序列，兩期之間常有 10–25 m 的偏移，拍攝也不定期；高雄 2024、2025 年的新影像只涵蓋不到 7% 的面積。所以只用來人工目視確認。</w:t>
+      </w:r>
+    </w:p>
+    <w:p>
+      <w:r>
+        <w:rPr>
+          <w:rFonts w:ascii="Microsoft JhengHei" w:hAnsi="Microsoft JhengHei" w:eastAsia="Microsoft JhengHei" w:cs="Microsoft JhengHei"/>
+          <w:b/>
+          <w:i w:val="0"/>
+          <w:sz w:val="22"/>
+        </w:rPr>
+        <w:t>Q：地質、斷層、順向坡有沒有納入？</w:t>
+      </w:r>
+    </w:p>
+    <w:p>
+      <w:r>
+        <w:rPr>
+          <w:rFonts w:ascii="Microsoft JhengHei" w:hAnsi="Microsoft JhengHei" w:eastAsia="Microsoft JhengHei" w:cs="Microsoft JhengHei"/>
+          <w:i w:val="0"/>
+          <w:sz w:val="22"/>
+        </w:rPr>
+        <w:t>還沒有。地質決定哪裡容易壞、降雨決定何時壞；我們目前做的是事件後找出變化並排出先看誰。用公開的小比例尺地層圖做了粗尺度的各地層崩塌密度：西村層板岩是平均的 1.5 倍（備用第 8 頁）。五萬分之一地質在 BigGIS 上是影像圖磚，要取得向量才能做斷層距離與順向坡分析，這是下一步。</w:t>
+      </w:r>
+    </w:p>
+    <w:p>
+      <w:r>
+        <w:rPr>
+          <w:rFonts w:ascii="Microsoft JhengHei" w:hAnsi="Microsoft JhengHei" w:eastAsia="Microsoft JhengHei" w:cs="Microsoft JhengHei"/>
+          <w:b/>
+          <w:i w:val="0"/>
+          <w:sz w:val="22"/>
+        </w:rPr>
+        <w:t>Q：崩了會影響誰？</w:t>
+      </w:r>
+    </w:p>
+    <w:p>
+      <w:r>
+        <w:rPr>
+          <w:rFonts w:ascii="Microsoft JhengHei" w:hAnsi="Microsoft JhengHei" w:eastAsia="Microsoft JhengHei" w:cs="Microsoft JhengHei"/>
+          <w:i w:val="0"/>
+          <w:sz w:val="22"/>
+        </w:rPr>
+        <w:t>用 OpenStreetMap 疊合道路與建物：每個坡面的證據頁會列出坡面內與外推 100 m 的道路長度、建物數與最近聚落。只作為參考資訊，不改候選層級。</w:t>
       </w:r>
     </w:p>
     <w:p>

</xml_diff>

<commit_message>
New landing page (five themes), debris-flow links and reference overlays on /su, 5 new UAV registrations
- /: concise landing for the finals (technical highlights, architecture, resilience, lessons for government and the public); former home moved to /system
- su_debris_link.py: per-slope debris-flow potential stream watershed, affected area within 100 m and nearest stream (ARDSWC BigGIS vector tiles snapshot); /su block 5, tiers unchanged
- /su map: NLSC yearly orthophotos 2014-2025, GSMMA dip-slope / historical landslide / geologically sensitive area tiles, NLSC lidar terrain change (reference only)
- UAV: 5 new registrations from 2026-09/10 uploads (3 at Liugui Baolai), total 35; uav_synth.find_rec reads uav_cands_2026c.json
- /roadmap module 5 now partial; deck slide 7, script, ARCHITECTURE appendix 20

Co-Authored-By: Claude Opus 5.5 <noreply@anthropic.com>
</commit_message>
<xml_diff>
--- a/presentation/講稿與背景說明.docx
+++ b/presentation/講稿與背景說明.docx
@@ -2344,7 +2344,7 @@
           <w:i w:val="0"/>
           <w:sz w:val="24"/>
         </w:rPr>
-        <w:t>專家提出的崩塌智慧防災平台有六個模組。我們目前做到的是平時篩查：坡地底圖、多源監測和 AI 輔助判釋都有一部分，其中道路與建物暴露是用 OpenStreetMap 疊合，回答坡面崩了會碰到什麼，但不改候選層級。地質目前只拿到影像圖磚，五萬分之一的斷層、位態、順向坡要取得向量後才能分析。降雨觸發、下游災害鏈和應變工作流還沒做，這是從平時篩查走向事件反應的下一步。</w:t>
+        <w:t>專家提出的崩塌智慧防災平台有六個模組。我們目前做到的是平時篩查：坡地底圖、多源監測和 AI 輔助判釋都有一部分，其中道路與建物暴露是用 OpenStreetMap 疊合，回答坡面崩了會碰到什麼，但不改候選層級。地質目前只拿到影像圖磚，五萬分之一的斷層、位態、順向坡要取得向量後才能分析。下游影響目前只列出坡面所在的土石流潛勢溪流集水區與影響範圍；降雨觸發、土砂與河道的動態串接和應變工作流還沒做，這是從平時篩查走向事件反應的下一步。</w:t>
       </w:r>
     </w:p>
     <w:p>
@@ -2420,6 +2420,82 @@
           <w:sz w:val="22"/>
         </w:rPr>
         <w:t>OSM 由志工繪製，山區建物與產業道路常缺漏，數字是「至少有這些」。</w:t>
+      </w:r>
+    </w:p>
+    <w:p>
+      <w:pPr>
+        <w:pStyle w:val="ListBullet"/>
+      </w:pPr>
+      <w:r>
+        <w:rPr>
+          <w:rFonts w:ascii="Microsoft JhengHei" w:hAnsi="Microsoft JhengHei" w:eastAsia="Microsoft JhengHei" w:cs="Microsoft JhengHei"/>
+          <w:b/>
+          <w:i w:val="0"/>
+          <w:sz w:val="22"/>
+        </w:rPr>
+        <w:t>土石流潛勢溪流</w:t>
+      </w:r>
+      <w:r>
+        <w:rPr>
+          <w:rFonts w:ascii="Microsoft JhengHei" w:hAnsi="Microsoft JhengHei" w:eastAsia="Microsoft JhengHei" w:cs="Microsoft JhengHei"/>
+          <w:i w:val="0"/>
+          <w:sz w:val="22"/>
+        </w:rPr>
+        <w:t xml:space="preserve">：水保署 BigGIS 公開向量圖磚（2026-10-02 快照，精度約 10 m），高雄 POC 內 168 條。411 個優先坡面中 67 個位在潛勢溪流集水區內（重疊 ≥10% 坡面面積），29 個外推 100 m 碰到影響範圍；列在 </w:t>
+      </w:r>
+      <w:r>
+        <w:rPr>
+          <w:rFonts w:ascii="Consolas" w:hAnsi="Consolas" w:eastAsia="Microsoft JhengHei" w:cs="Consolas"/>
+          <w:i w:val="0"/>
+          <w:sz w:val="20"/>
+        </w:rPr>
+        <w:t>/su</w:t>
+      </w:r>
+      <w:r>
+        <w:rPr>
+          <w:rFonts w:ascii="Microsoft JhengHei" w:hAnsi="Microsoft JhengHei" w:eastAsia="Microsoft JhengHei" w:cs="Microsoft JhengHei"/>
+          <w:i w:val="0"/>
+          <w:sz w:val="22"/>
+        </w:rPr>
+        <w:t xml:space="preserve"> 證據頁第⑤區塊，不改候選層級。</w:t>
+      </w:r>
+    </w:p>
+    <w:p>
+      <w:pPr>
+        <w:pStyle w:val="ListBullet"/>
+      </w:pPr>
+      <w:r>
+        <w:rPr>
+          <w:rFonts w:ascii="Microsoft JhengHei" w:hAnsi="Microsoft JhengHei" w:eastAsia="Microsoft JhengHei" w:cs="Microsoft JhengHei"/>
+          <w:b/>
+          <w:i w:val="0"/>
+          <w:sz w:val="22"/>
+        </w:rPr>
+        <w:t>人工判讀參考疊圖</w:t>
+      </w:r>
+      <w:r>
+        <w:rPr>
+          <w:rFonts w:ascii="Microsoft JhengHei" w:hAnsi="Microsoft JhengHei" w:eastAsia="Microsoft JhengHei" w:cs="Microsoft JhengHei"/>
+          <w:i w:val="0"/>
+          <w:sz w:val="22"/>
+        </w:rPr>
+        <w:t>：</w:t>
+      </w:r>
+      <w:r>
+        <w:rPr>
+          <w:rFonts w:ascii="Consolas" w:hAnsi="Consolas" w:eastAsia="Microsoft JhengHei" w:cs="Consolas"/>
+          <w:i w:val="0"/>
+          <w:sz w:val="20"/>
+        </w:rPr>
+        <w:t>/su</w:t>
+      </w:r>
+      <w:r>
+        <w:rPr>
+          <w:rFonts w:ascii="Microsoft JhengHei" w:hAnsi="Microsoft JhengHei" w:eastAsia="Microsoft JhengHei" w:cs="Microsoft JhengHei"/>
+          <w:i w:val="0"/>
+          <w:sz w:val="22"/>
+        </w:rPr>
+        <w:t xml:space="preserve"> 地圖可疊地調所山崩地質資訊雲端服務平臺的順向坡判釋目錄、歷史山崩目錄、地質敏感區（山崩與地滑），以及國土測繪中心 2014–2025 逐年正射航照、空載光達地形變異分析圖（DDEM05）。只供目視參考，沒有拿來計算。</w:t>
       </w:r>
     </w:p>
     <w:p>

</xml_diff>

<commit_message>
Finals deck restructured around the five landing-page themes (7 main slides + 3 backup); speaker script and .docx rewritten
- Main: cover, problem, technical highlights, architecture, resilience (Taroko case + slope dossier numbers), lessons for government, lessons for the public + closing
- Backup: validation details (former slide 5), expert-vision mapping, per-stratum landslide density
- New images: Baolai UAV 3D overlay, /su 3D terrain view

Co-Authored-By: Claude Opus 5.5 <noreply@anthropic.com>
</commit_message>
<xml_diff>
--- a/presentation/講稿與背景說明.docx
+++ b/presentation/講稿與背景說明.docx
@@ -43,7 +43,7 @@
           <w:color w:val="5E6B63"/>
           <w:sz w:val="22"/>
         </w:rPr>
-        <w:t>（6 頁，限時 5 分鐘）。PowerPoint 的備忘稿與本文的「講稿」相同；本文另外補上每頁的背景、數字出處與評審可能的提問。</w:t>
+        <w:t>（主線 7 頁，限時 5 分鐘；另有備用第 8–10 頁供問答）。主線依網站首頁的五大主題排列：技術亮點、架構創新、韌性呈現、對公部門的啟示、對全民的啟示。PowerPoint 的備忘稿與本文的「講稿」相同；本文另外補上每頁的背景、數字出處與評審可能的提問。</w:t>
       </w:r>
     </w:p>
     <w:p>
@@ -84,7 +84,7 @@
       <w:tr>
         <w:tc>
           <w:tcPr>
-            <w:tcW w:type="dxa" w:w="1076"/>
+            <w:tcW w:type="dxa" w:w="1017"/>
             <w:shd w:val="clear" w:color="auto" w:fill="2C5F2D"/>
           </w:tcPr>
           <w:p>
@@ -107,7 +107,7 @@
         </w:tc>
         <w:tc>
           <w:tcPr>
-            <w:tcW w:type="dxa" w:w="6184"/>
+            <w:tcW w:type="dxa" w:w="6359"/>
             <w:shd w:val="clear" w:color="auto" w:fill="2C5F2D"/>
           </w:tcPr>
           <w:p>
@@ -130,7 +130,7 @@
         </w:tc>
         <w:tc>
           <w:tcPr>
-            <w:tcW w:type="dxa" w:w="1076"/>
+            <w:tcW w:type="dxa" w:w="1017"/>
             <w:shd w:val="clear" w:color="auto" w:fill="2C5F2D"/>
           </w:tcPr>
           <w:p>
@@ -153,7 +153,7 @@
         </w:tc>
         <w:tc>
           <w:tcPr>
-            <w:tcW w:type="dxa" w:w="1076"/>
+            <w:tcW w:type="dxa" w:w="1017"/>
             <w:shd w:val="clear" w:color="auto" w:fill="2C5F2D"/>
           </w:tcPr>
           <w:p>
@@ -178,7 +178,7 @@
       <w:tr>
         <w:tc>
           <w:tcPr>
-            <w:tcW w:type="dxa" w:w="1076"/>
+            <w:tcW w:type="dxa" w:w="1017"/>
           </w:tcPr>
           <w:p>
             <w:r/>
@@ -194,7 +194,7 @@
         </w:tc>
         <w:tc>
           <w:tcPr>
-            <w:tcW w:type="dxa" w:w="6184"/>
+            <w:tcW w:type="dxa" w:w="6359"/>
           </w:tcPr>
           <w:p>
             <w:r/>
@@ -210,7 +210,7 @@
         </w:tc>
         <w:tc>
           <w:tcPr>
-            <w:tcW w:type="dxa" w:w="1076"/>
+            <w:tcW w:type="dxa" w:w="1017"/>
           </w:tcPr>
           <w:p>
             <w:r/>
@@ -226,7 +226,7 @@
         </w:tc>
         <w:tc>
           <w:tcPr>
-            <w:tcW w:type="dxa" w:w="1076"/>
+            <w:tcW w:type="dxa" w:w="1017"/>
           </w:tcPr>
           <w:p>
             <w:r/>
@@ -244,7 +244,7 @@
       <w:tr>
         <w:tc>
           <w:tcPr>
-            <w:tcW w:type="dxa" w:w="1076"/>
+            <w:tcW w:type="dxa" w:w="1017"/>
           </w:tcPr>
           <w:p>
             <w:r/>
@@ -260,7 +260,7 @@
         </w:tc>
         <w:tc>
           <w:tcPr>
-            <w:tcW w:type="dxa" w:w="6184"/>
+            <w:tcW w:type="dxa" w:w="6359"/>
           </w:tcPr>
           <w:p>
             <w:r/>
@@ -276,7 +276,337 @@
         </w:tc>
         <w:tc>
           <w:tcPr>
-            <w:tcW w:type="dxa" w:w="1076"/>
+            <w:tcW w:type="dxa" w:w="1017"/>
+          </w:tcPr>
+          <w:p>
+            <w:r/>
+            <w:r>
+              <w:rPr>
+                <w:rFonts w:ascii="Microsoft JhengHei" w:hAnsi="Microsoft JhengHei" w:eastAsia="Microsoft JhengHei" w:cs="Microsoft JhengHei"/>
+                <w:i w:val="0"/>
+                <w:sz w:val="20"/>
+              </w:rPr>
+              <w:t>30</w:t>
+            </w:r>
+          </w:p>
+        </w:tc>
+        <w:tc>
+          <w:tcPr>
+            <w:tcW w:type="dxa" w:w="1017"/>
+          </w:tcPr>
+          <w:p>
+            <w:r/>
+            <w:r>
+              <w:rPr>
+                <w:rFonts w:ascii="Microsoft JhengHei" w:hAnsi="Microsoft JhengHei" w:eastAsia="Microsoft JhengHei" w:cs="Microsoft JhengHei"/>
+                <w:i w:val="0"/>
+                <w:sz w:val="20"/>
+              </w:rPr>
+              <w:t>0:50</w:t>
+            </w:r>
+          </w:p>
+        </w:tc>
+      </w:tr>
+      <w:tr>
+        <w:tc>
+          <w:tcPr>
+            <w:tcW w:type="dxa" w:w="1017"/>
+          </w:tcPr>
+          <w:p>
+            <w:r/>
+            <w:r>
+              <w:rPr>
+                <w:rFonts w:ascii="Microsoft JhengHei" w:hAnsi="Microsoft JhengHei" w:eastAsia="Microsoft JhengHei" w:cs="Microsoft JhengHei"/>
+                <w:i w:val="0"/>
+                <w:sz w:val="20"/>
+              </w:rPr>
+              <w:t>3</w:t>
+            </w:r>
+          </w:p>
+        </w:tc>
+        <w:tc>
+          <w:tcPr>
+            <w:tcW w:type="dxa" w:w="6359"/>
+          </w:tcPr>
+          <w:p>
+            <w:r/>
+            <w:r>
+              <w:rPr>
+                <w:rFonts w:ascii="Microsoft JhengHei" w:hAnsi="Microsoft JhengHei" w:eastAsia="Microsoft JhengHei" w:cs="Microsoft JhengHei"/>
+                <w:i w:val="0"/>
+                <w:sz w:val="20"/>
+              </w:rPr>
+              <w:t>技術亮點：免費衛星＋開放資料，每個數字都量過</w:t>
+            </w:r>
+          </w:p>
+        </w:tc>
+        <w:tc>
+          <w:tcPr>
+            <w:tcW w:type="dxa" w:w="1017"/>
+          </w:tcPr>
+          <w:p>
+            <w:r/>
+            <w:r>
+              <w:rPr>
+                <w:rFonts w:ascii="Microsoft JhengHei" w:hAnsi="Microsoft JhengHei" w:eastAsia="Microsoft JhengHei" w:cs="Microsoft JhengHei"/>
+                <w:i w:val="0"/>
+                <w:sz w:val="20"/>
+              </w:rPr>
+              <w:t>50</w:t>
+            </w:r>
+          </w:p>
+        </w:tc>
+        <w:tc>
+          <w:tcPr>
+            <w:tcW w:type="dxa" w:w="1017"/>
+          </w:tcPr>
+          <w:p>
+            <w:r/>
+            <w:r>
+              <w:rPr>
+                <w:rFonts w:ascii="Microsoft JhengHei" w:hAnsi="Microsoft JhengHei" w:eastAsia="Microsoft JhengHei" w:cs="Microsoft JhengHei"/>
+                <w:i w:val="0"/>
+                <w:sz w:val="20"/>
+              </w:rPr>
+              <w:t>1:40</w:t>
+            </w:r>
+          </w:p>
+        </w:tc>
+      </w:tr>
+      <w:tr>
+        <w:tc>
+          <w:tcPr>
+            <w:tcW w:type="dxa" w:w="1017"/>
+          </w:tcPr>
+          <w:p>
+            <w:r/>
+            <w:r>
+              <w:rPr>
+                <w:rFonts w:ascii="Microsoft JhengHei" w:hAnsi="Microsoft JhengHei" w:eastAsia="Microsoft JhengHei" w:cs="Microsoft JhengHei"/>
+                <w:i w:val="0"/>
+                <w:sz w:val="20"/>
+              </w:rPr>
+              <w:t>4</w:t>
+            </w:r>
+          </w:p>
+        </w:tc>
+        <w:tc>
+          <w:tcPr>
+            <w:tcW w:type="dxa" w:w="6359"/>
+          </w:tcPr>
+          <w:p>
+            <w:r/>
+            <w:r>
+              <w:rPr>
+                <w:rFonts w:ascii="Microsoft JhengHei" w:hAnsi="Microsoft JhengHei" w:eastAsia="Microsoft JhengHei" w:cs="Microsoft JhengHei"/>
+                <w:i w:val="0"/>
+                <w:sz w:val="20"/>
+              </w:rPr>
+              <w:t>架構創新：證據鏈分開呈現，不給總分，最後由人決定</w:t>
+            </w:r>
+          </w:p>
+        </w:tc>
+        <w:tc>
+          <w:tcPr>
+            <w:tcW w:type="dxa" w:w="1017"/>
+          </w:tcPr>
+          <w:p>
+            <w:r/>
+            <w:r>
+              <w:rPr>
+                <w:rFonts w:ascii="Microsoft JhengHei" w:hAnsi="Microsoft JhengHei" w:eastAsia="Microsoft JhengHei" w:cs="Microsoft JhengHei"/>
+                <w:i w:val="0"/>
+                <w:sz w:val="20"/>
+              </w:rPr>
+              <w:t>45</w:t>
+            </w:r>
+          </w:p>
+        </w:tc>
+        <w:tc>
+          <w:tcPr>
+            <w:tcW w:type="dxa" w:w="1017"/>
+          </w:tcPr>
+          <w:p>
+            <w:r/>
+            <w:r>
+              <w:rPr>
+                <w:rFonts w:ascii="Microsoft JhengHei" w:hAnsi="Microsoft JhengHei" w:eastAsia="Microsoft JhengHei" w:cs="Microsoft JhengHei"/>
+                <w:i w:val="0"/>
+                <w:sz w:val="20"/>
+              </w:rPr>
+              <w:t>2:25</w:t>
+            </w:r>
+          </w:p>
+        </w:tc>
+      </w:tr>
+      <w:tr>
+        <w:tc>
+          <w:tcPr>
+            <w:tcW w:type="dxa" w:w="1017"/>
+          </w:tcPr>
+          <w:p>
+            <w:r/>
+            <w:r>
+              <w:rPr>
+                <w:rFonts w:ascii="Microsoft JhengHei" w:hAnsi="Microsoft JhengHei" w:eastAsia="Microsoft JhengHei" w:cs="Microsoft JhengHei"/>
+                <w:i w:val="0"/>
+                <w:sz w:val="20"/>
+              </w:rPr>
+              <w:t>5</w:t>
+            </w:r>
+          </w:p>
+        </w:tc>
+        <w:tc>
+          <w:tcPr>
+            <w:tcW w:type="dxa" w:w="6359"/>
+          </w:tcPr>
+          <w:p>
+            <w:r/>
+            <w:r>
+              <w:rPr>
+                <w:rFonts w:ascii="Microsoft JhengHei" w:hAnsi="Microsoft JhengHei" w:eastAsia="Microsoft JhengHei" w:cs="Microsoft JhengHei"/>
+                <w:i w:val="0"/>
+                <w:sz w:val="20"/>
+              </w:rPr>
+              <w:t>韌性呈現：每個坡面一份履歷——壞過、在變、會碰到誰</w:t>
+            </w:r>
+          </w:p>
+        </w:tc>
+        <w:tc>
+          <w:tcPr>
+            <w:tcW w:type="dxa" w:w="1017"/>
+          </w:tcPr>
+          <w:p>
+            <w:r/>
+            <w:r>
+              <w:rPr>
+                <w:rFonts w:ascii="Microsoft JhengHei" w:hAnsi="Microsoft JhengHei" w:eastAsia="Microsoft JhengHei" w:cs="Microsoft JhengHei"/>
+                <w:i w:val="0"/>
+                <w:sz w:val="20"/>
+              </w:rPr>
+              <w:t>55</w:t>
+            </w:r>
+          </w:p>
+        </w:tc>
+        <w:tc>
+          <w:tcPr>
+            <w:tcW w:type="dxa" w:w="1017"/>
+          </w:tcPr>
+          <w:p>
+            <w:r/>
+            <w:r>
+              <w:rPr>
+                <w:rFonts w:ascii="Microsoft JhengHei" w:hAnsi="Microsoft JhengHei" w:eastAsia="Microsoft JhengHei" w:cs="Microsoft JhengHei"/>
+                <w:i w:val="0"/>
+                <w:sz w:val="20"/>
+              </w:rPr>
+              <w:t>3:20</w:t>
+            </w:r>
+          </w:p>
+        </w:tc>
+      </w:tr>
+      <w:tr>
+        <w:tc>
+          <w:tcPr>
+            <w:tcW w:type="dxa" w:w="1017"/>
+          </w:tcPr>
+          <w:p>
+            <w:r/>
+            <w:r>
+              <w:rPr>
+                <w:rFonts w:ascii="Microsoft JhengHei" w:hAnsi="Microsoft JhengHei" w:eastAsia="Microsoft JhengHei" w:cs="Microsoft JhengHei"/>
+                <w:i w:val="0"/>
+                <w:sz w:val="20"/>
+              </w:rPr>
+              <w:t>6</w:t>
+            </w:r>
+          </w:p>
+        </w:tc>
+        <w:tc>
+          <w:tcPr>
+            <w:tcW w:type="dxa" w:w="6359"/>
+          </w:tcPr>
+          <w:p>
+            <w:r/>
+            <w:r>
+              <w:rPr>
+                <w:rFonts w:ascii="Microsoft JhengHei" w:hAnsi="Microsoft JhengHei" w:eastAsia="Microsoft JhengHei" w:cs="Microsoft JhengHei"/>
+                <w:i w:val="0"/>
+                <w:sz w:val="20"/>
+              </w:rPr>
+              <w:t>對公部門的啟示：自動訊號只排「先看誰」，先量再用</w:t>
+            </w:r>
+          </w:p>
+        </w:tc>
+        <w:tc>
+          <w:tcPr>
+            <w:tcW w:type="dxa" w:w="1017"/>
+          </w:tcPr>
+          <w:p>
+            <w:r/>
+            <w:r>
+              <w:rPr>
+                <w:rFonts w:ascii="Microsoft JhengHei" w:hAnsi="Microsoft JhengHei" w:eastAsia="Microsoft JhengHei" w:cs="Microsoft JhengHei"/>
+                <w:i w:val="0"/>
+                <w:sz w:val="20"/>
+              </w:rPr>
+              <w:t>50</w:t>
+            </w:r>
+          </w:p>
+        </w:tc>
+        <w:tc>
+          <w:tcPr>
+            <w:tcW w:type="dxa" w:w="1017"/>
+          </w:tcPr>
+          <w:p>
+            <w:r/>
+            <w:r>
+              <w:rPr>
+                <w:rFonts w:ascii="Microsoft JhengHei" w:hAnsi="Microsoft JhengHei" w:eastAsia="Microsoft JhengHei" w:cs="Microsoft JhengHei"/>
+                <w:i w:val="0"/>
+                <w:sz w:val="20"/>
+              </w:rPr>
+              <w:t>4:10</w:t>
+            </w:r>
+          </w:p>
+        </w:tc>
+      </w:tr>
+      <w:tr>
+        <w:tc>
+          <w:tcPr>
+            <w:tcW w:type="dxa" w:w="1017"/>
+          </w:tcPr>
+          <w:p>
+            <w:r/>
+            <w:r>
+              <w:rPr>
+                <w:rFonts w:ascii="Microsoft JhengHei" w:hAnsi="Microsoft JhengHei" w:eastAsia="Microsoft JhengHei" w:cs="Microsoft JhengHei"/>
+                <w:i w:val="0"/>
+                <w:sz w:val="20"/>
+              </w:rPr>
+              <w:t>7</w:t>
+            </w:r>
+          </w:p>
+        </w:tc>
+        <w:tc>
+          <w:tcPr>
+            <w:tcW w:type="dxa" w:w="6359"/>
+          </w:tcPr>
+          <w:p>
+            <w:r/>
+            <w:r>
+              <w:rPr>
+                <w:rFonts w:ascii="Microsoft JhengHei" w:hAnsi="Microsoft JhengHei" w:eastAsia="Microsoft JhengHei" w:cs="Microsoft JhengHei"/>
+                <w:i w:val="0"/>
+                <w:sz w:val="20"/>
+              </w:rPr>
+              <w:t>對全民的啟示：看得懂、查得到、一起補（結語）</w:t>
+            </w:r>
+          </w:p>
+        </w:tc>
+        <w:tc>
+          <w:tcPr>
+            <w:tcW w:type="dxa" w:w="1017"/>
           </w:tcPr>
           <w:p>
             <w:r/>
@@ -292,7 +622,7 @@
         </w:tc>
         <w:tc>
           <w:tcPr>
-            <w:tcW w:type="dxa" w:w="1076"/>
+            <w:tcW w:type="dxa" w:w="1017"/>
           </w:tcPr>
           <w:p>
             <w:r/>
@@ -302,271 +632,7 @@
                 <w:i w:val="0"/>
                 <w:sz w:val="20"/>
               </w:rPr>
-              <w:t>1:00</w:t>
-            </w:r>
-          </w:p>
-        </w:tc>
-      </w:tr>
-      <w:tr>
-        <w:tc>
-          <w:tcPr>
-            <w:tcW w:type="dxa" w:w="1076"/>
-          </w:tcPr>
-          <w:p>
-            <w:r/>
-            <w:r>
-              <w:rPr>
-                <w:rFonts w:ascii="Microsoft JhengHei" w:hAnsi="Microsoft JhengHei" w:eastAsia="Microsoft JhengHei" w:cs="Microsoft JhengHei"/>
-                <w:i w:val="0"/>
-                <w:sz w:val="20"/>
-              </w:rPr>
-              <w:t>3</w:t>
-            </w:r>
-          </w:p>
-        </w:tc>
-        <w:tc>
-          <w:tcPr>
-            <w:tcW w:type="dxa" w:w="6184"/>
-          </w:tcPr>
-          <w:p>
-            <w:r/>
-            <w:r>
-              <w:rPr>
-                <w:rFonts w:ascii="Microsoft JhengHei" w:hAnsi="Microsoft JhengHei" w:eastAsia="Microsoft JhengHei" w:cs="Microsoft JhengHei"/>
-                <w:i w:val="0"/>
-                <w:sz w:val="20"/>
-              </w:rPr>
-              <w:t>以坡面為單位，四類證據分開，不給總分</w:t>
-            </w:r>
-          </w:p>
-        </w:tc>
-        <w:tc>
-          <w:tcPr>
-            <w:tcW w:type="dxa" w:w="1076"/>
-          </w:tcPr>
-          <w:p>
-            <w:r/>
-            <w:r>
-              <w:rPr>
-                <w:rFonts w:ascii="Microsoft JhengHei" w:hAnsi="Microsoft JhengHei" w:eastAsia="Microsoft JhengHei" w:cs="Microsoft JhengHei"/>
-                <w:i w:val="0"/>
-                <w:sz w:val="20"/>
-              </w:rPr>
-              <w:t>50</w:t>
-            </w:r>
-          </w:p>
-        </w:tc>
-        <w:tc>
-          <w:tcPr>
-            <w:tcW w:type="dxa" w:w="1076"/>
-          </w:tcPr>
-          <w:p>
-            <w:r/>
-            <w:r>
-              <w:rPr>
-                <w:rFonts w:ascii="Microsoft JhengHei" w:hAnsi="Microsoft JhengHei" w:eastAsia="Microsoft JhengHei" w:cs="Microsoft JhengHei"/>
-                <w:i w:val="0"/>
-                <w:sz w:val="20"/>
-              </w:rPr>
-              <w:t>1:50</w:t>
-            </w:r>
-          </w:p>
-        </w:tc>
-      </w:tr>
-      <w:tr>
-        <w:tc>
-          <w:tcPr>
-            <w:tcW w:type="dxa" w:w="1076"/>
-          </w:tcPr>
-          <w:p>
-            <w:r/>
-            <w:r>
-              <w:rPr>
-                <w:rFonts w:ascii="Microsoft JhengHei" w:hAnsi="Microsoft JhengHei" w:eastAsia="Microsoft JhengHei" w:cs="Microsoft JhengHei"/>
-                <w:i w:val="0"/>
-                <w:sz w:val="20"/>
-              </w:rPr>
-              <w:t>4</w:t>
-            </w:r>
-          </w:p>
-        </w:tc>
-        <w:tc>
-          <w:tcPr>
-            <w:tcW w:type="dxa" w:w="6184"/>
-          </w:tcPr>
-          <w:p>
-            <w:r/>
-            <w:r>
-              <w:rPr>
-                <w:rFonts w:ascii="Microsoft JhengHei" w:hAnsi="Microsoft JhengHei" w:eastAsia="Microsoft JhengHei" w:cs="Microsoft JhengHei"/>
-                <w:i w:val="0"/>
-                <w:sz w:val="20"/>
-              </w:rPr>
-              <w:t>案例：太魯閣 0403 地震，一個坡面的證據鏈</w:t>
-            </w:r>
-          </w:p>
-        </w:tc>
-        <w:tc>
-          <w:tcPr>
-            <w:tcW w:type="dxa" w:w="1076"/>
-          </w:tcPr>
-          <w:p>
-            <w:r/>
-            <w:r>
-              <w:rPr>
-                <w:rFonts w:ascii="Microsoft JhengHei" w:hAnsi="Microsoft JhengHei" w:eastAsia="Microsoft JhengHei" w:cs="Microsoft JhengHei"/>
-                <w:i w:val="0"/>
-                <w:sz w:val="20"/>
-              </w:rPr>
-              <w:t>45</w:t>
-            </w:r>
-          </w:p>
-        </w:tc>
-        <w:tc>
-          <w:tcPr>
-            <w:tcW w:type="dxa" w:w="1076"/>
-          </w:tcPr>
-          <w:p>
-            <w:r/>
-            <w:r>
-              <w:rPr>
-                <w:rFonts w:ascii="Microsoft JhengHei" w:hAnsi="Microsoft JhengHei" w:eastAsia="Microsoft JhengHei" w:cs="Microsoft JhengHei"/>
-                <w:i w:val="0"/>
-                <w:sz w:val="20"/>
-              </w:rPr>
-              <w:t>2:35</w:t>
-            </w:r>
-          </w:p>
-        </w:tc>
-      </w:tr>
-      <w:tr>
-        <w:tc>
-          <w:tcPr>
-            <w:tcW w:type="dxa" w:w="1076"/>
-          </w:tcPr>
-          <w:p>
-            <w:r/>
-            <w:r>
-              <w:rPr>
-                <w:rFonts w:ascii="Microsoft JhengHei" w:hAnsi="Microsoft JhengHei" w:eastAsia="Microsoft JhengHei" w:cs="Microsoft JhengHei"/>
-                <w:i w:val="0"/>
-                <w:sz w:val="20"/>
-              </w:rPr>
-              <w:t>5</w:t>
-            </w:r>
-          </w:p>
-        </w:tc>
-        <w:tc>
-          <w:tcPr>
-            <w:tcW w:type="dxa" w:w="6184"/>
-          </w:tcPr>
-          <w:p>
-            <w:r/>
-            <w:r>
-              <w:rPr>
-                <w:rFonts w:ascii="Microsoft JhengHei" w:hAnsi="Microsoft JhengHei" w:eastAsia="Microsoft JhengHei" w:cs="Microsoft JhengHei"/>
-                <w:i w:val="0"/>
-                <w:sz w:val="20"/>
-              </w:rPr>
-              <w:t>我們量了它準不準</w:t>
-            </w:r>
-          </w:p>
-        </w:tc>
-        <w:tc>
-          <w:tcPr>
-            <w:tcW w:type="dxa" w:w="1076"/>
-          </w:tcPr>
-          <w:p>
-            <w:r/>
-            <w:r>
-              <w:rPr>
-                <w:rFonts w:ascii="Microsoft JhengHei" w:hAnsi="Microsoft JhengHei" w:eastAsia="Microsoft JhengHei" w:cs="Microsoft JhengHei"/>
-                <w:i w:val="0"/>
-                <w:sz w:val="20"/>
-              </w:rPr>
-              <w:t>55</w:t>
-            </w:r>
-          </w:p>
-        </w:tc>
-        <w:tc>
-          <w:tcPr>
-            <w:tcW w:type="dxa" w:w="1076"/>
-          </w:tcPr>
-          <w:p>
-            <w:r/>
-            <w:r>
-              <w:rPr>
-                <w:rFonts w:ascii="Microsoft JhengHei" w:hAnsi="Microsoft JhengHei" w:eastAsia="Microsoft JhengHei" w:cs="Microsoft JhengHei"/>
-                <w:i w:val="0"/>
-                <w:sz w:val="20"/>
-              </w:rPr>
-              <w:t>3:30</w:t>
-            </w:r>
-          </w:p>
-        </w:tc>
-      </w:tr>
-      <w:tr>
-        <w:tc>
-          <w:tcPr>
-            <w:tcW w:type="dxa" w:w="1076"/>
-          </w:tcPr>
-          <w:p>
-            <w:r/>
-            <w:r>
-              <w:rPr>
-                <w:rFonts w:ascii="Microsoft JhengHei" w:hAnsi="Microsoft JhengHei" w:eastAsia="Microsoft JhengHei" w:cs="Microsoft JhengHei"/>
-                <w:i w:val="0"/>
-                <w:sz w:val="20"/>
-              </w:rPr>
-              <w:t>6</w:t>
-            </w:r>
-          </w:p>
-        </w:tc>
-        <w:tc>
-          <w:tcPr>
-            <w:tcW w:type="dxa" w:w="6184"/>
-          </w:tcPr>
-          <w:p>
-            <w:r/>
-            <w:r>
-              <w:rPr>
-                <w:rFonts w:ascii="Microsoft JhengHei" w:hAnsi="Microsoft JhengHei" w:eastAsia="Microsoft JhengHei" w:cs="Microsoft JhengHei"/>
-                <w:i w:val="0"/>
-                <w:sz w:val="20"/>
-              </w:rPr>
-              <w:t>可複製、可檢驗，交給第一線檢驗</w:t>
-            </w:r>
-          </w:p>
-        </w:tc>
-        <w:tc>
-          <w:tcPr>
-            <w:tcW w:type="dxa" w:w="1076"/>
-          </w:tcPr>
-          <w:p>
-            <w:r/>
-            <w:r>
-              <w:rPr>
-                <w:rFonts w:ascii="Microsoft JhengHei" w:hAnsi="Microsoft JhengHei" w:eastAsia="Microsoft JhengHei" w:cs="Microsoft JhengHei"/>
-                <w:i w:val="0"/>
-                <w:sz w:val="20"/>
-              </w:rPr>
-              <w:t>40</w:t>
-            </w:r>
-          </w:p>
-        </w:tc>
-        <w:tc>
-          <w:tcPr>
-            <w:tcW w:type="dxa" w:w="1076"/>
-          </w:tcPr>
-          <w:p>
-            <w:r/>
-            <w:r>
-              <w:rPr>
-                <w:rFonts w:ascii="Microsoft JhengHei" w:hAnsi="Microsoft JhengHei" w:eastAsia="Microsoft JhengHei" w:cs="Microsoft JhengHei"/>
-                <w:i w:val="0"/>
-                <w:sz w:val="20"/>
-              </w:rPr>
-              <w:t>4:10</w:t>
+              <w:t>4:50</w:t>
             </w:r>
           </w:p>
         </w:tc>
@@ -580,7 +646,7 @@
           <w:i w:val="0"/>
           <w:sz w:val="22"/>
         </w:rPr>
-        <w:t>預留約 50 秒緩衝。超時優先刪第 5 頁「舊版約 1/4」那句，再刪第 2 頁的三個數字。</w:t>
+        <w:t>只剩約 10 秒緩衝。超時優先刪第 2 頁的三個數字，再刪第 6 頁「69%」那句。</w:t>
       </w:r>
     </w:p>
     <w:p>
@@ -685,7 +751,7 @@
           <w:i w:val="0"/>
           <w:sz w:val="22"/>
         </w:rPr>
-        <w:t>線上系統：rhynowu-ardswc-resilience-observatory.hf.space（</w:t>
+        <w:t>線上系統：rhynowu-ardswc-resilience-observatory.hf.space。首頁就是五大主題；</w:t>
       </w:r>
       <w:r>
         <w:rPr>
@@ -717,7 +783,39 @@
           <w:i w:val="0"/>
           <w:sz w:val="22"/>
         </w:rPr>
-        <w:t xml:space="preserve"> 五區展示）。</w:t>
+        <w:t xml:space="preserve"> 五區展示、</w:t>
+      </w:r>
+      <w:r>
+        <w:rPr>
+          <w:rFonts w:ascii="Consolas" w:hAnsi="Consolas" w:eastAsia="Microsoft JhengHei" w:cs="Consolas"/>
+          <w:i w:val="0"/>
+          <w:sz w:val="20"/>
+        </w:rPr>
+        <w:t>/roadmap</w:t>
+      </w:r>
+      <w:r>
+        <w:rPr>
+          <w:rFonts w:ascii="Microsoft JhengHei" w:hAnsi="Microsoft JhengHei" w:eastAsia="Microsoft JhengHei" w:cs="Microsoft JhengHei"/>
+          <w:i w:val="0"/>
+          <w:sz w:val="22"/>
+        </w:rPr>
+        <w:t xml:space="preserve"> 系統藍圖對照、</w:t>
+      </w:r>
+      <w:r>
+        <w:rPr>
+          <w:rFonts w:ascii="Consolas" w:hAnsi="Consolas" w:eastAsia="Microsoft JhengHei" w:cs="Consolas"/>
+          <w:i w:val="0"/>
+          <w:sz w:val="20"/>
+        </w:rPr>
+        <w:t>/system</w:t>
+      </w:r>
+      <w:r>
+        <w:rPr>
+          <w:rFonts w:ascii="Microsoft JhengHei" w:hAnsi="Microsoft JhengHei" w:eastAsia="Microsoft JhengHei" w:cs="Microsoft JhengHei"/>
+          <w:i w:val="0"/>
+          <w:sz w:val="22"/>
+        </w:rPr>
+        <w:t xml:space="preserve"> 完整技術說明。</w:t>
       </w:r>
     </w:p>
     <w:p>
@@ -871,7 +969,7 @@
           <w:i w:val="0"/>
           <w:sz w:val="22"/>
         </w:rPr>
-        <w:t>：桃源、那瑪夏、六龜、甲仙，經緯度範圍 120.55–120.95E、22.95–23.35N，約 41×44 km。坡面數 13,175 是 v2 單元（見第 3 頁）。</w:t>
+        <w:t>：桃源、那瑪夏、六龜、甲仙，經緯度範圍 120.55–120.95E、22.95–23.35N，約 41×44 km。</w:t>
       </w:r>
     </w:p>
     <w:p>
@@ -899,7 +997,7 @@
           <w:color w:val="2C5F2D"/>
           <w:sz w:val="30"/>
         </w:rPr>
-        <w:t>第 3 頁　以坡面為單位，四類證據分開，不給總分</w:t>
+        <w:t>第 3 頁　技術亮點：免費衛星＋開放資料，每個數字都量過</w:t>
       </w:r>
     </w:p>
     <w:p>
@@ -926,7 +1024,7 @@
           <w:i w:val="0"/>
           <w:sz w:val="24"/>
         </w:rPr>
-        <w:t>方法上，我們以坡面為單位。依輔導委員建議，用集水區重疊法切坡面，只保留坡度 15 度以上的有效坡面，每個單元都是完整區塊。每個坡面有四類證據：事件目錄是主骨架，照片是補充，衛星只回答最近還有沒有變化，再加上影像品質提醒。四類分開呈現、不相加、不給總分，最後只給三種候選層級。</w:t>
+        <w:t>技術亮點有三個。第一，以坡面為單位：依輔導委員建議用集水區重疊法切出 1 萬 3 千個坡面，每個都是完整區塊。第二，用免費的 Sentinel-2 紅邊時間序列，在花蓮、太魯閣大事件後抓到 75% 和 43% 的崩塌坡面，沒有事件的坡面誤報約 2%；中間這張圖顯示，崩塌占坡面越大越抓得到。第三，水保署歷史影像平台上的 UAV 照片沒有 GPS，我們用特徵匹配和 20 m 地形自動對位，目前 35 組，包括 10 月 15 日剛上傳的六龜寶來。重點是：每個數字我們都量過準確度。</w:t>
       </w:r>
     </w:p>
     <w:p>
@@ -959,7 +1057,7 @@
           <w:i w:val="0"/>
           <w:sz w:val="22"/>
         </w:rPr>
-        <w:t>：內政部 20 m DEM；正 DEM 與反 DEM（地形反轉後，河網就是稜線）各切河段子集水區（河網門檻 20 ha），兩者疊合取交集，小於 2 ha 的併入共用邊界最長的鄰居。邊界沿稜線與谷線。</w:t>
+        <w:t>：內政部 20 m DEM；正 DEM 與反 DEM（地形反轉後，河網就是稜線）各切河段子集水區（河網門檻 20 ha），兩者疊合取交集，小於 2 ha 的併入共用邊界最長的鄰居。13,175 個原始單元，其中 12,730 個有坡度 ≥15° 的有效坡面（3×3 平均後 ≥15°，去掉 &lt;0.2 ha 碎塊）。</w:t>
       </w:r>
     </w:p>
     <w:p>
@@ -981,29 +1079,7 @@
           <w:i w:val="0"/>
           <w:sz w:val="22"/>
         </w:rPr>
-        <w:t>：舊版（v1，自寫的左右岸半坡面）有 85% 的單元由不相連的多塊組成，陳組長套疊後指出「沒有辦法變成一個完整的區塊」。v2 不連續比例 0%，面積中位數 12 ha。</w:t>
-      </w:r>
-    </w:p>
-    <w:p>
-      <w:pPr>
-        <w:pStyle w:val="ListBullet"/>
-      </w:pPr>
-      <w:r>
-        <w:rPr>
-          <w:rFonts w:ascii="Microsoft JhengHei" w:hAnsi="Microsoft JhengHei" w:eastAsia="Microsoft JhengHei" w:cs="Microsoft JhengHei"/>
-          <w:b/>
-          <w:i w:val="0"/>
-          <w:sz w:val="22"/>
-        </w:rPr>
-        <w:t>有效坡面</w:t>
-      </w:r>
-      <w:r>
-        <w:rPr>
-          <w:rFonts w:ascii="Microsoft JhengHei" w:hAnsi="Microsoft JhengHei" w:eastAsia="Microsoft JhengHei" w:cs="Microsoft JhengHei"/>
-          <w:i w:val="0"/>
-          <w:sz w:val="22"/>
-        </w:rPr>
-        <w:t>：坡度 3×3 平均後 ≥15°，去掉 &lt;0.2 ha 碎塊。15° 以下多為沖蝕、河床，與崩塌分開處理（陳組長建議）。原始單元幾何保留。</w:t>
+        <w:t>：舊版（v1）有 85% 的單元由不相連的多塊組成，陳組長套疊後指出「沒有辦法變成一個完整的區塊」。v2 不連續比例 0%，面積中位數 12 ha。</w:t>
       </w:r>
     </w:p>
     <w:p>
@@ -1041,7 +1117,302 @@
           <w:i w:val="0"/>
           <w:sz w:val="22"/>
         </w:rPr>
-        <w:t>，記錄 DEM、門檻、版本；換參數就是新版本，並以對照表對應新舊單元，不宣稱 ID 永久不變。</w:t>
+        <w:t>；換參數就是新版本，以對照表對應新舊單元。</w:t>
+      </w:r>
+    </w:p>
+    <w:p>
+      <w:pPr>
+        <w:pStyle w:val="ListBullet"/>
+      </w:pPr>
+      <w:r>
+        <w:rPr>
+          <w:rFonts w:ascii="Microsoft JhengHei" w:hAnsi="Microsoft JhengHei" w:eastAsia="Microsoft JhengHei" w:cs="Microsoft JhengHei"/>
+          <w:b/>
+          <w:i w:val="0"/>
+          <w:sz w:val="22"/>
+        </w:rPr>
+        <w:t>NDRE（紅邊正規化差異指數）</w:t>
+      </w:r>
+      <w:r>
+        <w:rPr>
+          <w:rFonts w:ascii="Microsoft JhengHei" w:hAnsi="Microsoft JhengHei" w:eastAsia="Microsoft JhengHei" w:cs="Microsoft JhengHei"/>
+          <w:i w:val="0"/>
+          <w:sz w:val="22"/>
+        </w:rPr>
+        <w:t>＝(B8A − B5) / (B8A + B5)，Sentinel-2 L2A 地表反射率；植被茂密時約 0.6，裸露時接近 0。參考水保署技術電子報第 173 期。每個日期 SCL 去雲，坡面內有效像元 ≥50% 才採用，取有效坡面中位數，再扣掉同日全區中位數。</w:t>
+      </w:r>
+    </w:p>
+    <w:p>
+      <w:pPr>
+        <w:pStyle w:val="ListBullet"/>
+      </w:pPr>
+      <w:r>
+        <w:rPr>
+          <w:rFonts w:ascii="Microsoft JhengHei" w:hAnsi="Microsoft JhengHei" w:eastAsia="Microsoft JhengHei" w:cs="Microsoft JhengHei"/>
+          <w:b/>
+          <w:i w:val="0"/>
+          <w:sz w:val="22"/>
+        </w:rPr>
+        <w:t>持續下降規則</w:t>
+      </w:r>
+      <w:r>
+        <w:rPr>
+          <w:rFonts w:ascii="Microsoft JhengHei" w:hAnsi="Microsoft JhengHei" w:eastAsia="Microsoft JhengHei" w:cs="Microsoft JhengHei"/>
+          <w:i w:val="0"/>
+          <w:sz w:val="22"/>
+        </w:rPr>
+        <w:t>：比基準低 0.08 以上，之後 6 筆至少 3 筆偏低，60 天後仍偏低。門檻是看過資料後訂的，尚未獨立驗證。</w:t>
+      </w:r>
+    </w:p>
+    <w:p>
+      <w:pPr>
+        <w:pStyle w:val="ListBullet"/>
+      </w:pPr>
+      <w:r>
+        <w:rPr>
+          <w:rFonts w:ascii="Microsoft JhengHei" w:hAnsi="Microsoft JhengHei" w:eastAsia="Microsoft JhengHei" w:cs="Microsoft JhengHei"/>
+          <w:b/>
+          <w:i w:val="0"/>
+          <w:sz w:val="22"/>
+        </w:rPr>
+        <w:t>中間長條圖</w:t>
+      </w:r>
+      <w:r>
+        <w:rPr>
+          <w:rFonts w:ascii="Microsoft JhengHei" w:hAnsi="Microsoft JhengHei" w:eastAsia="Microsoft JhengHei" w:cs="Microsoft JhengHei"/>
+          <w:i w:val="0"/>
+          <w:sz w:val="22"/>
+        </w:rPr>
+        <w:t>：太魯閣依「事件崩塌占有效坡面的比例」分組的偵測率：&lt;5% 7%、5–10% 15%、10–20% 42%、20–40% 75%、≥40% 93%（坡面數 588、184、163、108、29）。坡面中位數約只看得到占坡面兩成以上的崩塌。</w:t>
+      </w:r>
+    </w:p>
+    <w:p>
+      <w:pPr>
+        <w:pStyle w:val="ListBullet"/>
+      </w:pPr>
+      <w:r>
+        <w:rPr>
+          <w:rFonts w:ascii="Microsoft JhengHei" w:hAnsi="Microsoft JhengHei" w:eastAsia="Microsoft JhengHei" w:cs="Microsoft JhengHei"/>
+          <w:b/>
+          <w:i w:val="0"/>
+          <w:sz w:val="22"/>
+        </w:rPr>
+        <w:t>UAV 自動對位</w:t>
+      </w:r>
+      <w:r>
+        <w:rPr>
+          <w:rFonts w:ascii="Microsoft JhengHei" w:hAnsi="Microsoft JhengHei" w:eastAsia="Microsoft JhengHei" w:cs="Microsoft JhengHei"/>
+          <w:i w:val="0"/>
+          <w:sz w:val="22"/>
+        </w:rPr>
+        <w:t>：歷史影像平台的 UAV 照片沒有 EXIF／GPS。近垂直照用 LoFTR 特徵匹配＋單應矩陣；斜拍照用 20 m DTM 與 Esri 底圖合成斜視圖，再以 LoFTR 匹配、相機姿態解算（PnP）。留出 30% 匹配點檢核，地面誤差 RMSE ≤10 m 才發布。2026-10-25 新抓 352 張（2026-08-27 之後上傳），篩出 33 張候選，新增 5 組通過（六龜寶來 3 組 RMSE 3.1–5.5 m、南投信義、花蓮秀林），總數 35 組。</w:t>
+      </w:r>
+    </w:p>
+    <w:p>
+      <w:pPr>
+        <w:pStyle w:val="ListBullet"/>
+      </w:pPr>
+      <w:r>
+        <w:rPr>
+          <w:rFonts w:ascii="Microsoft JhengHei" w:hAnsi="Microsoft JhengHei" w:eastAsia="Microsoft JhengHei" w:cs="Microsoft JhengHei"/>
+          <w:b/>
+          <w:i w:val="0"/>
+          <w:sz w:val="22"/>
+        </w:rPr>
+        <w:t>UAV 的定位</w:t>
+      </w:r>
+      <w:r>
+        <w:rPr>
+          <w:rFonts w:ascii="Microsoft JhengHei" w:hAnsi="Microsoft JhengHei" w:eastAsia="Microsoft JhengHei" w:cs="Microsoft JhengHei"/>
+          <w:i w:val="0"/>
+          <w:sz w:val="22"/>
+        </w:rPr>
+        <w:t>：依陳組長建議已停止擴充，保留成果展示（</w:t>
+      </w:r>
+      <w:r>
+        <w:rPr>
+          <w:rFonts w:ascii="Consolas" w:hAnsi="Consolas" w:eastAsia="Microsoft JhengHei" w:cs="Consolas"/>
+          <w:i w:val="0"/>
+          <w:sz w:val="20"/>
+        </w:rPr>
+        <w:t>/roadmap</w:t>
+      </w:r>
+      <w:r>
+        <w:rPr>
+          <w:rFonts w:ascii="Microsoft JhengHei" w:hAnsi="Microsoft JhengHei" w:eastAsia="Microsoft JhengHei" w:cs="Microsoft JhengHei"/>
+          <w:i w:val="0"/>
+          <w:sz w:val="22"/>
+        </w:rPr>
+        <w:t xml:space="preserve"> 連到 3D 檢視頁）。被問到時說「它解決的是歷史照片沒有座標的問題，不是主線」。</w:t>
+      </w:r>
+    </w:p>
+    <w:p>
+      <w:pPr>
+        <w:pBdr>
+          <w:bottom w:val="single" w:sz="6" w:space="1" w:color="C8D3CA"/>
+        </w:pBdr>
+      </w:pPr>
+    </w:p>
+    <w:p>
+      <w:pPr>
+        <w:pStyle w:val="Heading1"/>
+        <w:spacing w:before="280"/>
+      </w:pPr>
+      <w:r>
+        <w:rPr>
+          <w:b/>
+        </w:rPr>
+      </w:r>
+      <w:r>
+        <w:rPr>
+          <w:rFonts w:ascii="Microsoft JhengHei" w:hAnsi="Microsoft JhengHei" w:eastAsia="Microsoft JhengHei" w:cs="Microsoft JhengHei"/>
+          <w:b/>
+          <w:i w:val="0"/>
+          <w:color w:val="2C5F2D"/>
+          <w:sz w:val="30"/>
+        </w:rPr>
+        <w:t>第 4 頁　架構創新：證據鏈分開呈現，不給總分，最後由人決定</w:t>
+      </w:r>
+    </w:p>
+    <w:p>
+      <w:r>
+        <w:rPr>
+          <w:rFonts w:ascii="Microsoft JhengHei" w:hAnsi="Microsoft JhengHei" w:eastAsia="Microsoft JhengHei" w:cs="Microsoft JhengHei"/>
+          <w:b/>
+          <w:i w:val="0"/>
+          <w:sz w:val="22"/>
+        </w:rPr>
+        <w:t>講稿</w:t>
+      </w:r>
+    </w:p>
+    <w:p>
+      <w:pPr>
+        <w:pBdr>
+          <w:left w:val="single" w:sz="18" w:space="8" w:color="2C5F2D"/>
+        </w:pBdr>
+        <w:ind w:left="227"/>
+      </w:pPr>
+      <w:r>
+        <w:rPr>
+          <w:rFonts w:ascii="Microsoft JhengHei" w:hAnsi="Microsoft JhengHei" w:eastAsia="Microsoft JhengHei" w:cs="Microsoft JhengHei"/>
+          <w:i w:val="0"/>
+          <w:sz w:val="24"/>
+        </w:rPr>
+        <w:t>架構上，資料全部是開放資料，切成坡面單元後，每個坡面掛五類證據：事件目錄是主骨架，照片是補充，衛星只回答最近還有沒有變化，再加上影像品質提醒，以及崩了會碰到什麼——道路、聚落和土石流潛勢溪流。我們刻意不給總分，因為分數會掩蓋為什麼；看不到就標資料不足；驗證紀錄可以稽核。最後只給三種候選層級，由人決定要不要去。</w:t>
+      </w:r>
+    </w:p>
+    <w:p>
+      <w:r>
+        <w:rPr>
+          <w:rFonts w:ascii="Microsoft JhengHei" w:hAnsi="Microsoft JhengHei" w:eastAsia="Microsoft JhengHei" w:cs="Microsoft JhengHei"/>
+          <w:b/>
+          <w:i w:val="0"/>
+          <w:sz w:val="22"/>
+        </w:rPr>
+        <w:t>背景</w:t>
+      </w:r>
+    </w:p>
+    <w:p>
+      <w:pPr>
+        <w:pStyle w:val="ListBullet"/>
+      </w:pPr>
+      <w:r>
+        <w:rPr>
+          <w:rFonts w:ascii="Microsoft JhengHei" w:hAnsi="Microsoft JhengHei" w:eastAsia="Microsoft JhengHei" w:cs="Microsoft JhengHei"/>
+          <w:b/>
+          <w:i w:val="0"/>
+          <w:sz w:val="22"/>
+        </w:rPr>
+        <w:t>五類證據</w:t>
+      </w:r>
+      <w:r>
+        <w:rPr>
+          <w:rFonts w:ascii="Microsoft JhengHei" w:hAnsi="Microsoft JhengHei" w:eastAsia="Microsoft JhengHei" w:cs="Microsoft JhengHei"/>
+          <w:i w:val="0"/>
+          <w:sz w:val="22"/>
+        </w:rPr>
+        <w:t>（</w:t>
+      </w:r>
+      <w:r>
+        <w:rPr>
+          <w:rFonts w:ascii="Consolas" w:hAnsi="Consolas" w:eastAsia="Microsoft JhengHei" w:cs="Consolas"/>
+          <w:i w:val="0"/>
+          <w:sz w:val="20"/>
+        </w:rPr>
+        <w:t>/su</w:t>
+      </w:r>
+      <w:r>
+        <w:rPr>
+          <w:rFonts w:ascii="Microsoft JhengHei" w:hAnsi="Microsoft JhengHei" w:eastAsia="Microsoft JhengHei" w:cs="Microsoft JhengHei"/>
+          <w:i w:val="0"/>
+          <w:sz w:val="22"/>
+        </w:rPr>
+        <w:t xml:space="preserve"> 每個坡面頁的 ①–⑤ 區塊）：</w:t>
+      </w:r>
+    </w:p>
+    <w:p>
+      <w:pPr>
+        <w:pStyle w:val="ListBullet2"/>
+      </w:pPr>
+      <w:r>
+        <w:rPr>
+          <w:rFonts w:ascii="Microsoft JhengHei" w:hAnsi="Microsoft JhengHei" w:eastAsia="Microsoft JhengHei" w:cs="Microsoft JhengHei"/>
+          <w:i w:val="0"/>
+          <w:sz w:val="22"/>
+        </w:rPr>
+        <w:t>① 事件目錄與年度圖層：類別、四年裸露面積、新增裸露、窗口內事件。</w:t>
+      </w:r>
+    </w:p>
+    <w:p>
+      <w:pPr>
+        <w:pStyle w:val="ListBullet2"/>
+      </w:pPr>
+      <w:r>
+        <w:rPr>
+          <w:rFonts w:ascii="Microsoft JhengHei" w:hAnsi="Microsoft JhengHei" w:eastAsia="Microsoft JhengHei" w:cs="Microsoft JhengHei"/>
+          <w:i w:val="0"/>
+          <w:sz w:val="22"/>
+        </w:rPr>
+        <w:t>② 現地照片：筆數、年份、描述分類（規則式初分）。</w:t>
+      </w:r>
+    </w:p>
+    <w:p>
+      <w:pPr>
+        <w:pStyle w:val="ListBullet2"/>
+      </w:pPr>
+      <w:r>
+        <w:rPr>
+          <w:rFonts w:ascii="Microsoft JhengHei" w:hAnsi="Microsoft JhengHei" w:eastAsia="Microsoft JhengHei" w:cs="Microsoft JhengHei"/>
+          <w:i w:val="0"/>
+          <w:sz w:val="22"/>
+        </w:rPr>
+        <w:t>③ 近期衛星變化：Sentinel-2 NDRE 逐月曲線與持續下降日期。</w:t>
+      </w:r>
+    </w:p>
+    <w:p>
+      <w:pPr>
+        <w:pStyle w:val="ListBullet2"/>
+      </w:pPr>
+      <w:r>
+        <w:rPr>
+          <w:rFonts w:ascii="Microsoft JhengHei" w:hAnsi="Microsoft JhengHei" w:eastAsia="Microsoft JhengHei" w:cs="Microsoft JhengHei"/>
+          <w:i w:val="0"/>
+          <w:sz w:val="22"/>
+        </w:rPr>
+        <w:t>④ 影像品質：有效觀測筆數、Wayback 拍攝日、偏移提醒。</w:t>
+      </w:r>
+    </w:p>
+    <w:p>
+      <w:pPr>
+        <w:pStyle w:val="ListBullet2"/>
+      </w:pPr>
+      <w:r>
+        <w:rPr>
+          <w:rFonts w:ascii="Microsoft JhengHei" w:hAnsi="Microsoft JhengHei" w:eastAsia="Microsoft JhengHei" w:cs="Microsoft JhengHei"/>
+          <w:i w:val="0"/>
+          <w:sz w:val="22"/>
+        </w:rPr>
+        <w:t>⑤ 崩了會碰到什麼：OSM 道路長度、建物數、最近聚落；水保署土石流潛勢溪流集水區、影響範圍與保全住戶。</w:t>
       </w:r>
     </w:p>
     <w:p>
@@ -1107,6 +1478,19 @@
     </w:p>
     <w:p>
       <w:pPr>
+        <w:pStyle w:val="ListBullet2"/>
+      </w:pPr>
+      <w:r>
+        <w:rPr>
+          <w:rFonts w:ascii="Microsoft JhengHei" w:hAnsi="Microsoft JhengHei" w:eastAsia="Microsoft JhengHei" w:cs="Microsoft JhengHei"/>
+          <w:i w:val="0"/>
+          <w:sz w:val="22"/>
+        </w:rPr>
+        <w:t>全區：優先 411、一般 12,105、資料不足 214。⑤ 不影響層級。</w:t>
+      </w:r>
+    </w:p>
+    <w:p>
+      <w:pPr>
         <w:pStyle w:val="ListBullet"/>
       </w:pPr>
       <w:r>
@@ -1125,6 +1509,44 @@
           <w:sz w:val="22"/>
         </w:rPr>
         <w:t>：證據來源與準確度不同，相加會讓人誤以為是風險機率。</w:t>
+      </w:r>
+    </w:p>
+    <w:p>
+      <w:pPr>
+        <w:pStyle w:val="ListBullet"/>
+      </w:pPr>
+      <w:r>
+        <w:rPr>
+          <w:rFonts w:ascii="Microsoft JhengHei" w:hAnsi="Microsoft JhengHei" w:eastAsia="Microsoft JhengHei" w:cs="Microsoft JhengHei"/>
+          <w:b/>
+          <w:i w:val="0"/>
+          <w:sz w:val="22"/>
+        </w:rPr>
+        <w:t>可稽核</w:t>
+      </w:r>
+      <w:r>
+        <w:rPr>
+          <w:rFonts w:ascii="Microsoft JhengHei" w:hAnsi="Microsoft JhengHei" w:eastAsia="Microsoft JhengHei" w:cs="Microsoft JhengHei"/>
+          <w:i w:val="0"/>
+          <w:sz w:val="22"/>
+        </w:rPr>
+        <w:t>：分層人工驗證的判讀表與結果附 SHA-256 稽核清單（</w:t>
+      </w:r>
+      <w:r>
+        <w:rPr>
+          <w:rFonts w:ascii="Consolas" w:hAnsi="Consolas" w:eastAsia="Microsoft JhengHei" w:cs="Consolas"/>
+          <w:i w:val="0"/>
+          <w:sz w:val="20"/>
+        </w:rPr>
+        <w:t>/static/poc/audit/</w:t>
+      </w:r>
+      <w:r>
+        <w:rPr>
+          <w:rFonts w:ascii="Microsoft JhengHei" w:hAnsi="Microsoft JhengHei" w:eastAsia="Microsoft JhengHei" w:cs="Microsoft JhengHei"/>
+          <w:i w:val="0"/>
+          <w:sz w:val="22"/>
+        </w:rPr>
+        <w:t>）。Wayback 等高解析影像只提示「該用哪一期去看」，不改 NDRE 數值、也不降級。</w:t>
       </w:r>
     </w:p>
     <w:p>
@@ -1152,7 +1574,7 @@
           <w:color w:val="2C5F2D"/>
           <w:sz w:val="30"/>
         </w:rPr>
-        <w:t>第 4 頁　案例：太魯閣 0403 地震，一個坡面的證據鏈</w:t>
+        <w:t>第 5 頁　韌性呈現：每個坡面一份履歷——壞過、在變、會碰到誰</w:t>
       </w:r>
     </w:p>
     <w:p>
@@ -1179,7 +1601,7 @@
           <w:i w:val="0"/>
           <w:sz w:val="24"/>
         </w:rPr>
-        <w:t>看一個太魯閣的例子。白線是一個坡面，橘線是官方事件目錄圈出的地震崩塌，占了這個坡面的一半。地震前 3 月底，紅邊指標 0.53；地震後 11 天掉到 0.20，之後一直沒有回來，而全區中位數只是正常的季節起伏。事件目錄、衛星變化兩類證據指向同一件事，這個坡面就會被列入人工判讀候選，最後由人決定要不要去。線上系統的太魯閣頁可以看到全部 329 個下降坡面。</w:t>
+        <w:t>韌性呈現在於每個坡面都有一份履歷。左邊是太魯閣一個坡面：橘線是官方圈出的地震崩塌，地震後紅邊指標從 0.53 掉到 0.20，之後沒有回來，全區只是正常季節起伏。太魯閣 330 個持續下降的坡面中，229 個出現在地震當月，大事件後幾週內就能列出要先看的坡面。履歷也回答崩了會碰到誰：高雄 411 個優先坡面中，200 個附近有道路，67 個位在土石流潛勢溪流集水區。</w:t>
       </w:r>
     </w:p>
     <w:p>
@@ -1200,10 +1622,19 @@
       <w:r>
         <w:rPr>
           <w:rFonts w:ascii="Microsoft JhengHei" w:hAnsi="Microsoft JhengHei" w:eastAsia="Microsoft JhengHei" w:cs="Microsoft JhengHei"/>
+          <w:b/>
           <w:i w:val="0"/>
           <w:sz w:val="22"/>
         </w:rPr>
-        <w:t xml:space="preserve">坡面 </w:t>
+        <w:t>案例坡面</w:t>
+      </w:r>
+      <w:r>
+        <w:rPr>
+          <w:rFonts w:ascii="Microsoft JhengHei" w:hAnsi="Microsoft JhengHei" w:eastAsia="Microsoft JhengHei" w:cs="Microsoft JhengHei"/>
+          <w:i w:val="0"/>
+          <w:sz w:val="22"/>
+        </w:rPr>
+        <w:t xml:space="preserve"> </w:t>
       </w:r>
       <w:r>
         <w:rPr>
@@ -1229,10 +1660,19 @@
       <w:r>
         <w:rPr>
           <w:rFonts w:ascii="Microsoft JhengHei" w:hAnsi="Microsoft JhengHei" w:eastAsia="Microsoft JhengHei" w:cs="Microsoft JhengHei"/>
+          <w:b/>
           <w:i w:val="0"/>
           <w:sz w:val="22"/>
         </w:rPr>
-        <w:t>左邊動態圖是 Sentinel-2 真彩色 2024-03-25（地震前）與 2024-04-14（地震後 11 天），已做對比增強，投影時自動交替；PDF 版只顯示第一張。這一帶沒有地震後的 Wayback 高解析影像。</w:t>
+        <w:t>左邊動態圖</w:t>
+      </w:r>
+      <w:r>
+        <w:rPr>
+          <w:rFonts w:ascii="Microsoft JhengHei" w:hAnsi="Microsoft JhengHei" w:eastAsia="Microsoft JhengHei" w:cs="Microsoft JhengHei"/>
+          <w:i w:val="0"/>
+          <w:sz w:val="22"/>
+        </w:rPr>
+        <w:t>：Sentinel-2 真彩色 2024-03-25（地震前）與 2024-04-14（地震後 11 天），已做對比增強，投影時自動交替；PDF 版只顯示第一張。這一帶沒有地震後的 Wayback 高解析影像。</w:t>
       </w:r>
     </w:p>
     <w:p>
@@ -1242,10 +1682,19 @@
       <w:r>
         <w:rPr>
           <w:rFonts w:ascii="Microsoft JhengHei" w:hAnsi="Microsoft JhengHei" w:eastAsia="Microsoft JhengHei" w:cs="Microsoft JhengHei"/>
+          <w:b/>
           <w:i w:val="0"/>
           <w:sz w:val="22"/>
         </w:rPr>
-        <w:t>右邊折線是此坡面與全區（太魯閣 5,469 個坡面）的 NDRE 逐月中位數。全區在 2024-05 也有一次短暫下降，隨即回升，屬於雲霧或季節起伏；此坡面則持續偏低。</w:t>
+        <w:t>折線</w:t>
+      </w:r>
+      <w:r>
+        <w:rPr>
+          <w:rFonts w:ascii="Microsoft JhengHei" w:hAnsi="Microsoft JhengHei" w:eastAsia="Microsoft JhengHei" w:cs="Microsoft JhengHei"/>
+          <w:i w:val="0"/>
+          <w:sz w:val="22"/>
+        </w:rPr>
+        <w:t>：此坡面與全區（太魯閣 5,469 個坡面）的 NDRE 逐月中位數。全區在 2024-05 有一次短暫下降隨即回升，屬於雲霧或季節起伏。</w:t>
       </w:r>
     </w:p>
     <w:p>
@@ -1255,23 +1704,19 @@
       <w:r>
         <w:rPr>
           <w:rFonts w:ascii="Microsoft JhengHei" w:hAnsi="Microsoft JhengHei" w:eastAsia="Microsoft JhengHei" w:cs="Microsoft JhengHei"/>
+          <w:b/>
           <w:i w:val="0"/>
           <w:sz w:val="22"/>
         </w:rPr>
-        <w:t>太魯閣沒有像高雄那樣的候選層級頁，所以講「列入人工判讀候選」，不要說「系統判為優先」。</w:t>
+        <w:t>229／330</w:t>
       </w:r>
-    </w:p>
-    <w:p>
-      <w:pPr>
-        <w:pStyle w:val="ListBullet"/>
-      </w:pPr>
       <w:r>
         <w:rPr>
           <w:rFonts w:ascii="Microsoft JhengHei" w:hAnsi="Microsoft JhengHei" w:eastAsia="Microsoft JhengHei" w:cs="Microsoft JhengHei"/>
           <w:i w:val="0"/>
           <w:sz w:val="22"/>
         </w:rPr>
-        <w:t>線上：</w:t>
+        <w:t>：太魯閣持續下降的坡面共 330 個（</w:t>
       </w:r>
       <w:r>
         <w:rPr>
@@ -1287,7 +1732,89 @@
           <w:i w:val="0"/>
           <w:sz w:val="22"/>
         </w:rPr>
-        <w:t xml:space="preserve"> 的「③ A 太魯閣」分頁，預設開啟「坡面 NDRE 持續下降」圖層（329 個坡面）與事件目錄。</w:t>
+        <w:t xml:space="preserve"> 太魯閣分頁的圖層畫出 329 個），下降日期在 2024-04 的有 229 個。太魯閣沒有候選層級頁，所以講「列入要先看的坡面」，不要說「系統判為優先」。</w:t>
+      </w:r>
+    </w:p>
+    <w:p>
+      <w:pPr>
+        <w:pStyle w:val="ListBullet"/>
+      </w:pPr>
+      <w:r>
+        <w:rPr>
+          <w:rFonts w:ascii="Microsoft JhengHei" w:hAnsi="Microsoft JhengHei" w:eastAsia="Microsoft JhengHei" w:cs="Microsoft JhengHei"/>
+          <w:b/>
+          <w:i w:val="0"/>
+          <w:sz w:val="22"/>
+        </w:rPr>
+        <w:t>200／411、25</w:t>
+      </w:r>
+      <w:r>
+        <w:rPr>
+          <w:rFonts w:ascii="Microsoft JhengHei" w:hAnsi="Microsoft JhengHei" w:eastAsia="Microsoft JhengHei" w:cs="Microsoft JhengHei"/>
+          <w:i w:val="0"/>
+          <w:sz w:val="22"/>
+        </w:rPr>
+        <w:t>：OpenStreetMap（Geofabrik 臺灣擷取 2026-10-25）道路與建物，坡面外推 100 m；山區常缺漏，數字是下限。</w:t>
+      </w:r>
+    </w:p>
+    <w:p>
+      <w:pPr>
+        <w:pStyle w:val="ListBullet"/>
+      </w:pPr>
+      <w:r>
+        <w:rPr>
+          <w:rFonts w:ascii="Microsoft JhengHei" w:hAnsi="Microsoft JhengHei" w:eastAsia="Microsoft JhengHei" w:cs="Microsoft JhengHei"/>
+          <w:b/>
+          <w:i w:val="0"/>
+          <w:sz w:val="22"/>
+        </w:rPr>
+        <w:t>67</w:t>
+      </w:r>
+      <w:r>
+        <w:rPr>
+          <w:rFonts w:ascii="Microsoft JhengHei" w:hAnsi="Microsoft JhengHei" w:eastAsia="Microsoft JhengHei" w:cs="Microsoft JhengHei"/>
+          <w:i w:val="0"/>
+          <w:sz w:val="22"/>
+        </w:rPr>
+        <w:t>：水保署 BigGIS 土石流潛勢溪流集水區（公開向量圖磚，2026-10-02 快照，精度約 10 m），坡面與集水區重疊 ≥10%。另有 29 個優先坡面外推 100 m 碰到潛勢溪流影響範圍。</w:t>
+      </w:r>
+    </w:p>
+    <w:p>
+      <w:pPr>
+        <w:pStyle w:val="ListBullet"/>
+      </w:pPr>
+      <w:r>
+        <w:rPr>
+          <w:rFonts w:ascii="Microsoft JhengHei" w:hAnsi="Microsoft JhengHei" w:eastAsia="Microsoft JhengHei" w:cs="Microsoft JhengHei"/>
+          <w:b/>
+          <w:i w:val="0"/>
+          <w:sz w:val="22"/>
+        </w:rPr>
+        <w:t>線上</w:t>
+      </w:r>
+      <w:r>
+        <w:rPr>
+          <w:rFonts w:ascii="Microsoft JhengHei" w:hAnsi="Microsoft JhengHei" w:eastAsia="Microsoft JhengHei" w:cs="Microsoft JhengHei"/>
+          <w:i w:val="0"/>
+          <w:sz w:val="22"/>
+        </w:rPr>
+        <w:t>：</w:t>
+      </w:r>
+      <w:r>
+        <w:rPr>
+          <w:rFonts w:ascii="Consolas" w:hAnsi="Consolas" w:eastAsia="Microsoft JhengHei" w:cs="Consolas"/>
+          <w:i w:val="0"/>
+          <w:sz w:val="20"/>
+        </w:rPr>
+        <w:t>/su</w:t>
+      </w:r>
+      <w:r>
+        <w:rPr>
+          <w:rFonts w:ascii="Microsoft JhengHei" w:hAnsi="Microsoft JhengHei" w:eastAsia="Microsoft JhengHei" w:cs="Microsoft JhengHei"/>
+          <w:i w:val="0"/>
+          <w:sz w:val="22"/>
+        </w:rPr>
+        <w:t xml:space="preserve"> 坡面頁第⑤區塊；地圖可切 3D 地形與國土測繪中心逐年航照。</w:t>
       </w:r>
     </w:p>
     <w:p>
@@ -1315,7 +1842,7 @@
           <w:color w:val="2C5F2D"/>
           <w:sz w:val="30"/>
         </w:rPr>
-        <w:t>第 5 頁　我們量了它準不準</w:t>
+        <w:t>第 6 頁　對公部門的啟示：自動訊號只排「先看誰」，先量再用</w:t>
       </w:r>
     </w:p>
     <w:p>
@@ -1342,7 +1869,7 @@
           <w:i w:val="0"/>
           <w:sz w:val="24"/>
         </w:rPr>
-        <w:t>我們不只做系統，也量了它準不準。影像目視與官方圖層的有無裸露一致率只有 69%；舊版近期變化訊號約四分之一屬實。我們參考水保署電子報改用紅邊指標。在高雄全區，零星的下降經分層盲判只有約 25% 屬實，信賴區間 5% 到 45%；但在大事件後，花蓮有 75%、太魯閣有 43% 的崩塌坡面被抓到，沒有事件的坡面誤報約 2%。左邊這張圖是太魯閣：崩塌占坡面不到 5% 時只抓到 7%，超過四成時抓到 93%。所以紅邊指標適合大事件後快速找出植被大片消失的坡面，自動訊號只用來排出先看誰，最後一定由人確認。</w:t>
+        <w:t>對公部門的啟示：我們量了準確度。大事件後，花蓮 75%、太魯閣 43% 的崩塌坡面被抓到；但平時零星的紅邊下降，經分層盲判只有約 25% 屬實；連人看影像和官方圖層的一致率也只有 69%。所以自動訊號只能排先看誰，不能拿來判定，導入前一定要先量。這套流程全用開放資料、可以搬到其他流域；而 UAV 照片上傳時保留座標、事件目錄附判釋日期，這種小改變就能省下大量事後工作。</w:t>
       </w:r>
     </w:p>
     <w:p>
@@ -1354,6 +1881,14 @@
           <w:sz w:val="22"/>
         </w:rPr>
         <w:t>每個數字的意思</w:t>
+      </w:r>
+      <w:r>
+        <w:rPr>
+          <w:rFonts w:ascii="Microsoft JhengHei" w:hAnsi="Microsoft JhengHei" w:eastAsia="Microsoft JhengHei" w:cs="Microsoft JhengHei"/>
+          <w:i w:val="0"/>
+          <w:sz w:val="22"/>
+        </w:rPr>
+        <w:t>（備用第 8 頁有完整版）</w:t>
       </w:r>
     </w:p>
     <w:tbl>
@@ -1460,204 +1995,6 @@
                 <w:sz w:val="20"/>
               </w:rPr>
               <w:t>95% 信賴區間</w:t>
-            </w:r>
-          </w:p>
-        </w:tc>
-      </w:tr>
-      <w:tr>
-        <w:tc>
-          <w:tcPr>
-            <w:tcW w:type="dxa" w:w="659"/>
-          </w:tcPr>
-          <w:p>
-            <w:r/>
-            <w:r>
-              <w:rPr>
-                <w:rFonts w:ascii="Microsoft JhengHei" w:hAnsi="Microsoft JhengHei" w:eastAsia="Microsoft JhengHei" w:cs="Microsoft JhengHei"/>
-                <w:i w:val="0"/>
-                <w:sz w:val="20"/>
-              </w:rPr>
-              <w:t>69%</w:t>
-            </w:r>
-          </w:p>
-        </w:tc>
-        <w:tc>
-          <w:tcPr>
-            <w:tcW w:type="dxa" w:w="3764"/>
-          </w:tcPr>
-          <w:p>
-            <w:r/>
-            <w:r>
-              <w:rPr>
-                <w:rFonts w:ascii="Microsoft JhengHei" w:hAnsi="Microsoft JhengHei" w:eastAsia="Microsoft JhengHei" w:cs="Microsoft JhengHei"/>
-                <w:i w:val="0"/>
-                <w:sz w:val="20"/>
-              </w:rPr>
-              <w:t>人工看影像判斷「有沒有裸露」，與官方年度圖層一致的比例</w:t>
-            </w:r>
-          </w:p>
-        </w:tc>
-        <w:tc>
-          <w:tcPr>
-            <w:tcW w:type="dxa" w:w="3388"/>
-          </w:tcPr>
-          <w:p>
-            <w:r/>
-            <w:r>
-              <w:rPr>
-                <w:rFonts w:ascii="Microsoft JhengHei" w:hAnsi="Microsoft JhengHei" w:eastAsia="Microsoft JhengHei" w:cs="Microsoft JhengHei"/>
-                <w:i w:val="0"/>
-                <w:sz w:val="20"/>
-              </w:rPr>
-              <w:t>30 個坡面盲測，29 個可判讀（20/29）；類別嚴格一致只有 28%</w:t>
-            </w:r>
-          </w:p>
-        </w:tc>
-        <w:tc>
-          <w:tcPr>
-            <w:tcW w:type="dxa" w:w="1600"/>
-          </w:tcPr>
-          <w:p>
-            <w:r/>
-            <w:r>
-              <w:rPr>
-                <w:rFonts w:ascii="Microsoft JhengHei" w:hAnsi="Microsoft JhengHei" w:eastAsia="Microsoft JhengHei" w:cs="Microsoft JhengHei"/>
-                <w:i w:val="0"/>
-                <w:sz w:val="20"/>
-              </w:rPr>
-              <w:t>51–83%</w:t>
-            </w:r>
-          </w:p>
-        </w:tc>
-      </w:tr>
-      <w:tr>
-        <w:tc>
-          <w:tcPr>
-            <w:tcW w:type="dxa" w:w="659"/>
-          </w:tcPr>
-          <w:p>
-            <w:r/>
-            <w:r>
-              <w:rPr>
-                <w:rFonts w:ascii="Microsoft JhengHei" w:hAnsi="Microsoft JhengHei" w:eastAsia="Microsoft JhengHei" w:cs="Microsoft JhengHei"/>
-                <w:i w:val="0"/>
-                <w:sz w:val="20"/>
-              </w:rPr>
-              <w:t>約 1/4</w:t>
-            </w:r>
-          </w:p>
-        </w:tc>
-        <w:tc>
-          <w:tcPr>
-            <w:tcW w:type="dxa" w:w="3764"/>
-          </w:tcPr>
-          <w:p>
-            <w:r/>
-            <w:r>
-              <w:rPr>
-                <w:rFonts w:ascii="Microsoft JhengHei" w:hAnsi="Microsoft JhengHei" w:eastAsia="Microsoft JhengHei" w:cs="Microsoft JhengHei"/>
-                <w:i w:val="0"/>
-                <w:sz w:val="20"/>
-              </w:rPr>
-              <w:t>舊版「近期有變化」訊號（事件歸因、Sentinel-2 真彩色兩期規則）經人工確認屬實的比例</w:t>
-            </w:r>
-          </w:p>
-        </w:tc>
-        <w:tc>
-          <w:tcPr>
-            <w:tcW w:type="dxa" w:w="3388"/>
-          </w:tcPr>
-          <w:p>
-            <w:r/>
-            <w:r>
-              <w:rPr>
-                <w:rFonts w:ascii="Microsoft JhengHei" w:hAnsi="Microsoft JhengHei" w:eastAsia="Microsoft JhengHei" w:cs="Microsoft JhengHei"/>
-                <w:i w:val="0"/>
-                <w:sz w:val="20"/>
-              </w:rPr>
-              <w:t>24 個分層坡面驗證中的 S1 層（1/4，舊版 v1 單元）</w:t>
-            </w:r>
-          </w:p>
-        </w:tc>
-        <w:tc>
-          <w:tcPr>
-            <w:tcW w:type="dxa" w:w="1600"/>
-          </w:tcPr>
-          <w:p>
-            <w:r/>
-            <w:r>
-              <w:rPr>
-                <w:rFonts w:ascii="Microsoft JhengHei" w:hAnsi="Microsoft JhengHei" w:eastAsia="Microsoft JhengHei" w:cs="Microsoft JhengHei"/>
-                <w:i w:val="0"/>
-                <w:sz w:val="20"/>
-              </w:rPr>
-              <w:t>5–70%</w:t>
-            </w:r>
-          </w:p>
-        </w:tc>
-      </w:tr>
-      <w:tr>
-        <w:tc>
-          <w:tcPr>
-            <w:tcW w:type="dxa" w:w="659"/>
-          </w:tcPr>
-          <w:p>
-            <w:r/>
-            <w:r>
-              <w:rPr>
-                <w:rFonts w:ascii="Microsoft JhengHei" w:hAnsi="Microsoft JhengHei" w:eastAsia="Microsoft JhengHei" w:cs="Microsoft JhengHei"/>
-                <w:i w:val="0"/>
-                <w:sz w:val="20"/>
-              </w:rPr>
-              <w:t>約 25%</w:t>
-            </w:r>
-          </w:p>
-        </w:tc>
-        <w:tc>
-          <w:tcPr>
-            <w:tcW w:type="dxa" w:w="3764"/>
-          </w:tcPr>
-          <w:p>
-            <w:r/>
-            <w:r>
-              <w:rPr>
-                <w:rFonts w:ascii="Microsoft JhengHei" w:hAnsi="Microsoft JhengHei" w:eastAsia="Microsoft JhengHei" w:cs="Microsoft JhengHei"/>
-                <w:i w:val="0"/>
-                <w:sz w:val="20"/>
-              </w:rPr>
-              <w:t>高雄全區 NDRE「持續下降」的坡面，人工看前後影像確認有新增或擴大裸露的比例</w:t>
-            </w:r>
-          </w:p>
-        </w:tc>
-        <w:tc>
-          <w:tcPr>
-            <w:tcW w:type="dxa" w:w="3388"/>
-          </w:tcPr>
-          <w:p>
-            <w:r/>
-            <w:r>
-              <w:rPr>
-                <w:rFonts w:ascii="Microsoft JhengHei" w:hAnsi="Microsoft JhengHei" w:eastAsia="Microsoft JhengHei" w:cs="Microsoft JhengHei"/>
-                <w:i w:val="0"/>
-                <w:sz w:val="20"/>
-              </w:rPr>
-              <w:t>26 個下降坡面分層盲判（5/26），依各層母體數加權；對照組 1/6</w:t>
-            </w:r>
-          </w:p>
-        </w:tc>
-        <w:tc>
-          <w:tcPr>
-            <w:tcW w:type="dxa" w:w="1600"/>
-          </w:tcPr>
-          <w:p>
-            <w:r/>
-            <w:r>
-              <w:rPr>
-                <w:rFonts w:ascii="Microsoft JhengHei" w:hAnsi="Microsoft JhengHei" w:eastAsia="Microsoft JhengHei" w:cs="Microsoft JhengHei"/>
-                <w:i w:val="0"/>
-                <w:sz w:val="20"/>
-              </w:rPr>
-              <w:t>5–45%（對照組 3–56%）</w:t>
             </w:r>
           </w:p>
         </w:tc>
@@ -1810,6 +2147,138 @@
           </w:p>
         </w:tc>
       </w:tr>
+      <w:tr>
+        <w:tc>
+          <w:tcPr>
+            <w:tcW w:type="dxa" w:w="659"/>
+          </w:tcPr>
+          <w:p>
+            <w:r/>
+            <w:r>
+              <w:rPr>
+                <w:rFonts w:ascii="Microsoft JhengHei" w:hAnsi="Microsoft JhengHei" w:eastAsia="Microsoft JhengHei" w:cs="Microsoft JhengHei"/>
+                <w:i w:val="0"/>
+                <w:sz w:val="20"/>
+              </w:rPr>
+              <w:t>約 25%</w:t>
+            </w:r>
+          </w:p>
+        </w:tc>
+        <w:tc>
+          <w:tcPr>
+            <w:tcW w:type="dxa" w:w="3764"/>
+          </w:tcPr>
+          <w:p>
+            <w:r/>
+            <w:r>
+              <w:rPr>
+                <w:rFonts w:ascii="Microsoft JhengHei" w:hAnsi="Microsoft JhengHei" w:eastAsia="Microsoft JhengHei" w:cs="Microsoft JhengHei"/>
+                <w:i w:val="0"/>
+                <w:sz w:val="20"/>
+              </w:rPr>
+              <w:t>高雄全區 NDRE「持續下降」的坡面，人工看前後影像確認有新增或擴大裸露的比例</w:t>
+            </w:r>
+          </w:p>
+        </w:tc>
+        <w:tc>
+          <w:tcPr>
+            <w:tcW w:type="dxa" w:w="3388"/>
+          </w:tcPr>
+          <w:p>
+            <w:r/>
+            <w:r>
+              <w:rPr>
+                <w:rFonts w:ascii="Microsoft JhengHei" w:hAnsi="Microsoft JhengHei" w:eastAsia="Microsoft JhengHei" w:cs="Microsoft JhengHei"/>
+                <w:i w:val="0"/>
+                <w:sz w:val="20"/>
+              </w:rPr>
+              <w:t>26 個下降坡面分層盲判（5/26），依各層母體數加權；對照組 1/6</w:t>
+            </w:r>
+          </w:p>
+        </w:tc>
+        <w:tc>
+          <w:tcPr>
+            <w:tcW w:type="dxa" w:w="1600"/>
+          </w:tcPr>
+          <w:p>
+            <w:r/>
+            <w:r>
+              <w:rPr>
+                <w:rFonts w:ascii="Microsoft JhengHei" w:hAnsi="Microsoft JhengHei" w:eastAsia="Microsoft JhengHei" w:cs="Microsoft JhengHei"/>
+                <w:i w:val="0"/>
+                <w:sz w:val="20"/>
+              </w:rPr>
+              <w:t>5–45%（對照組 3–56%）</w:t>
+            </w:r>
+          </w:p>
+        </w:tc>
+      </w:tr>
+      <w:tr>
+        <w:tc>
+          <w:tcPr>
+            <w:tcW w:type="dxa" w:w="659"/>
+          </w:tcPr>
+          <w:p>
+            <w:r/>
+            <w:r>
+              <w:rPr>
+                <w:rFonts w:ascii="Microsoft JhengHei" w:hAnsi="Microsoft JhengHei" w:eastAsia="Microsoft JhengHei" w:cs="Microsoft JhengHei"/>
+                <w:i w:val="0"/>
+                <w:sz w:val="20"/>
+              </w:rPr>
+              <w:t>69%</w:t>
+            </w:r>
+          </w:p>
+        </w:tc>
+        <w:tc>
+          <w:tcPr>
+            <w:tcW w:type="dxa" w:w="3764"/>
+          </w:tcPr>
+          <w:p>
+            <w:r/>
+            <w:r>
+              <w:rPr>
+                <w:rFonts w:ascii="Microsoft JhengHei" w:hAnsi="Microsoft JhengHei" w:eastAsia="Microsoft JhengHei" w:cs="Microsoft JhengHei"/>
+                <w:i w:val="0"/>
+                <w:sz w:val="20"/>
+              </w:rPr>
+              <w:t>人工看影像判斷「有沒有裸露」，與官方年度圖層一致的比例</w:t>
+            </w:r>
+          </w:p>
+        </w:tc>
+        <w:tc>
+          <w:tcPr>
+            <w:tcW w:type="dxa" w:w="3388"/>
+          </w:tcPr>
+          <w:p>
+            <w:r/>
+            <w:r>
+              <w:rPr>
+                <w:rFonts w:ascii="Microsoft JhengHei" w:hAnsi="Microsoft JhengHei" w:eastAsia="Microsoft JhengHei" w:cs="Microsoft JhengHei"/>
+                <w:i w:val="0"/>
+                <w:sz w:val="20"/>
+              </w:rPr>
+              <w:t>30 個坡面盲測，29 個可判讀（20/29）；類別嚴格一致只有 28%</w:t>
+            </w:r>
+          </w:p>
+        </w:tc>
+        <w:tc>
+          <w:tcPr>
+            <w:tcW w:type="dxa" w:w="1600"/>
+          </w:tcPr>
+          <w:p>
+            <w:r/>
+            <w:r>
+              <w:rPr>
+                <w:rFonts w:ascii="Microsoft JhengHei" w:hAnsi="Microsoft JhengHei" w:eastAsia="Microsoft JhengHei" w:cs="Microsoft JhengHei"/>
+                <w:i w:val="0"/>
+                <w:sz w:val="20"/>
+              </w:rPr>
+              <w:t>51–83%</w:t>
+            </w:r>
+          </w:p>
+        </w:tc>
+      </w:tr>
     </w:tbl>
     <w:p/>
     <w:p>
@@ -1842,7 +2311,7 @@
           <w:i w:val="0"/>
           <w:sz w:val="22"/>
         </w:rPr>
-        <w:t>：比例用 Wilson 區間；高雄 NDRE 的 25% 是分層抽樣估計（各層屬實比例依該層母體數加權：官方期間有裸露 56 個、無裸露 22 個、官方之後 112 個），方法參考 Olofsson et al. (2014)、Stehman (2014)。花蓮、太魯閣是全數比對，區間表示「換一場類似事件時」的不確定性。樣本小，區間只當量級參考（</w:t>
+        <w:t>：比例用 Wilson 區間；高雄 NDRE 的 25% 是分層抽樣估計（各層屬實比例依該層母體數加權），方法參考 Olofsson et al. (2014)、Stehman (2014)。花蓮、太魯閣是全數比對，區間表示「換一場類似事件時」的不確定性（</w:t>
       </w:r>
       <w:r>
         <w:rPr>
@@ -1872,7 +2341,7 @@
           <w:i w:val="0"/>
           <w:sz w:val="22"/>
         </w:rPr>
-        <w:t>NDRE（紅邊正規化差異指數）</w:t>
+        <w:t>為什麼高雄只有約 25%、大事件區卻很高</w:t>
       </w:r>
       <w:r>
         <w:rPr>
@@ -1880,7 +2349,7 @@
           <w:i w:val="0"/>
           <w:sz w:val="22"/>
         </w:rPr>
-        <w:t>＝(B8A − B5) / (B8A + B5)，用 Sentinel-2 L2A 地表反射率；植被茂密時高（約 0.6），裸露時接近 0。參考水保署技術電子報第 173 期〈利用 Sentinel-2 紅邊指標追蹤 0403 地震後坡地變化〉。</w:t>
+        <w:t>：高雄全區的下降多是零星、門檻邊緣的小幅變化，加上夏季雲霧；大事件區崩塌面積大、時間集中，訊號就清楚。</w:t>
       </w:r>
     </w:p>
     <w:p>
@@ -1894,7 +2363,7 @@
           <w:i w:val="0"/>
           <w:sz w:val="22"/>
         </w:rPr>
-        <w:t>計算方式</w:t>
+        <w:t>可複製</w:t>
       </w:r>
       <w:r>
         <w:rPr>
@@ -1902,7 +2371,7 @@
           <w:i w:val="0"/>
           <w:sz w:val="22"/>
         </w:rPr>
-        <w:t>：每個日期用 SCL 去雲與雲影，坡面內有效像元 ≥50% 才採用，取有效坡面的中位數，再扣掉同日全區中位數（去除季節與大氣的共同起伏）。</w:t>
+        <w:t>：水保署 BigGIS、歷史影像平台、內政部 20 m DEM、Sentinel-2（Microsoft Planetary Computer，免費）、Esri Wayback、OpenStreetMap；工具為 Python、WhiteboxTools、GeoPandas、Leaflet、CesiumJS、Flask。程式在 GitHub：RhynoW/ardswc-resilience-observatory。高雄完成完整流程；花蓮、太魯閣加做坡面紅邊檢核；中部、嘉義測試過衛星與事件比對。</w:t>
       </w:r>
     </w:p>
     <w:p>
@@ -1916,7 +2385,7 @@
           <w:i w:val="0"/>
           <w:sz w:val="22"/>
         </w:rPr>
-        <w:t>持續下降規則</w:t>
+        <w:t>資料治理建議的依據</w:t>
       </w:r>
       <w:r>
         <w:rPr>
@@ -1924,112 +2393,7 @@
           <w:i w:val="0"/>
           <w:sz w:val="22"/>
         </w:rPr>
-        <w:t>：比基準低 0.08 以上，之後 6 筆至少 3 筆偏低，60 天後仍偏低。門檻是看過資料後訂的，尚未獨立驗證。</w:t>
-      </w:r>
-    </w:p>
-    <w:p>
-      <w:pPr>
-        <w:pStyle w:val="ListBullet"/>
-      </w:pPr>
-      <w:r>
-        <w:rPr>
-          <w:rFonts w:ascii="Microsoft JhengHei" w:hAnsi="Microsoft JhengHei" w:eastAsia="Microsoft JhengHei" w:cs="Microsoft JhengHei"/>
-          <w:b/>
-          <w:i w:val="0"/>
-          <w:sz w:val="22"/>
-        </w:rPr>
-        <w:t>為什麼高雄只有約 25%、大事件區卻很高</w:t>
-      </w:r>
-      <w:r>
-        <w:rPr>
-          <w:rFonts w:ascii="Microsoft JhengHei" w:hAnsi="Microsoft JhengHei" w:eastAsia="Microsoft JhengHei" w:cs="Microsoft JhengHei"/>
-          <w:i w:val="0"/>
-          <w:sz w:val="22"/>
-        </w:rPr>
-        <w:t>：</w:t>
-      </w:r>
-    </w:p>
-    <w:p>
-      <w:pPr>
-        <w:pStyle w:val="ListBullet2"/>
-      </w:pPr>
-      <w:r>
-        <w:rPr>
-          <w:rFonts w:ascii="Microsoft JhengHei" w:hAnsi="Microsoft JhengHei" w:eastAsia="Microsoft JhengHei" w:cs="Microsoft JhengHei"/>
-          <w:i w:val="0"/>
-          <w:sz w:val="22"/>
-        </w:rPr>
-        <w:t>坡面中位數只看得到占坡面約兩成以上的崩塌。太魯閣崩塌占坡面 &lt;5% 時只抓到 7%，≥40% 時 93%。</w:t>
-      </w:r>
-    </w:p>
-    <w:p>
-      <w:pPr>
-        <w:pStyle w:val="ListBullet2"/>
-      </w:pPr>
-      <w:r>
-        <w:rPr>
-          <w:rFonts w:ascii="Microsoft JhengHei" w:hAnsi="Microsoft JhengHei" w:eastAsia="Microsoft JhengHei" w:cs="Microsoft JhengHei"/>
-          <w:i w:val="0"/>
-          <w:sz w:val="22"/>
-        </w:rPr>
-        <w:t>高雄全區的下降多是零星、門檻邊緣的小幅變化，加上夏季雲霧干擾。</w:t>
-      </w:r>
-    </w:p>
-    <w:p>
-      <w:pPr>
-        <w:pStyle w:val="ListBullet2"/>
-      </w:pPr>
-      <w:r>
-        <w:rPr>
-          <w:rFonts w:ascii="Microsoft JhengHei" w:hAnsi="Microsoft JhengHei" w:eastAsia="Microsoft JhengHei" w:cs="Microsoft JhengHei"/>
-          <w:i w:val="0"/>
-          <w:sz w:val="22"/>
-        </w:rPr>
-        <w:t>大事件區的崩塌面積大、時間集中，訊號就清楚。</w:t>
-      </w:r>
-    </w:p>
-    <w:p>
-      <w:pPr>
-        <w:pStyle w:val="ListBullet"/>
-      </w:pPr>
-      <w:r>
-        <w:rPr>
-          <w:rFonts w:ascii="Microsoft JhengHei" w:hAnsi="Microsoft JhengHei" w:eastAsia="Microsoft JhengHei" w:cs="Microsoft JhengHei"/>
-          <w:b/>
-          <w:i w:val="0"/>
-          <w:sz w:val="22"/>
-        </w:rPr>
-        <w:t>紅邊有沒有比 NDVI 好</w:t>
-      </w:r>
-      <w:r>
-        <w:rPr>
-          <w:rFonts w:ascii="Microsoft JhengHei" w:hAnsi="Microsoft JhengHei" w:eastAsia="Microsoft JhengHei" w:cs="Microsoft JhengHei"/>
-          <w:i w:val="0"/>
-          <w:sz w:val="22"/>
-        </w:rPr>
-        <w:t>：小試驗中 NDVI、NDRE、MTCI 抓到同一批坡面，紅邊沒有明顯優勢；選 NDRE 是因為 B5、B8A 都是 20 m，不需重採樣。</w:t>
-      </w:r>
-    </w:p>
-    <w:p>
-      <w:pPr>
-        <w:pStyle w:val="ListBullet"/>
-      </w:pPr>
-      <w:r>
-        <w:rPr>
-          <w:rFonts w:ascii="Microsoft JhengHei" w:hAnsi="Microsoft JhengHei" w:eastAsia="Microsoft JhengHei" w:cs="Microsoft JhengHei"/>
-          <w:b/>
-          <w:i w:val="0"/>
-          <w:sz w:val="22"/>
-        </w:rPr>
-        <w:t>左邊長條圖</w:t>
-      </w:r>
-      <w:r>
-        <w:rPr>
-          <w:rFonts w:ascii="Microsoft JhengHei" w:hAnsi="Microsoft JhengHei" w:eastAsia="Microsoft JhengHei" w:cs="Microsoft JhengHei"/>
-          <w:i w:val="0"/>
-          <w:sz w:val="22"/>
-        </w:rPr>
-        <w:t>：太魯閣依「事件崩塌占有效坡面的比例」分組的偵測率：&lt;5% 7%、5–10% 15%、10–20% 42%、20–40% 75%、≥40% 93%（坡面數 588、184、163、108、29）。</w:t>
+        <w:t>：歷史影像平台的 UAV 照片沒有 EXIF／GPS，我們必須逐張以影像內容對位，33 張候選只有 5 張通過；若上傳時保留座標與時間，這一步幾乎不需要。</w:t>
       </w:r>
     </w:p>
     <w:p>
@@ -2057,7 +2421,7 @@
           <w:color w:val="2C5F2D"/>
           <w:sz w:val="30"/>
         </w:rPr>
-        <w:t>第 6 頁　可複製、可檢驗，交給第一線檢驗</w:t>
+        <w:t>第 7 頁　對全民的啟示：看得懂、查得到、一起補（結語）</w:t>
       </w:r>
     </w:p>
     <w:p>
@@ -2084,7 +2448,7 @@
           <w:i w:val="0"/>
           <w:sz w:val="24"/>
         </w:rPr>
-        <w:t>最後，這套流程全用開放資料與開源工具，程式公開，高雄完成完整流程，花蓮、太魯閣也加做了坡面紅邊檢核，另外兩區測試過衛星與事件比對。接下來請專家盲判與第一線同仁實際操作，依結果調整規則。我們不是重新發明崩塌判釋，而是把既有證據整理成可追蹤的坡面履歷：機器幫忙決定先看誰，證據鏈告訴你為什麼，最後由人決定要不要去。謝謝。</w:t>
+        <w:t>最後，對全民的啟示：坡地資訊要看得懂、查得到、也能一起補。我們不給風險分數，看不到就說看不到；每個坡面頁列出附近的道路、建物和土石流潛勢溪流，還能用 3D 和逐年航照看；山區建物在 OpenStreetMap 常缺漏，志工補上的每一筆都有用，程式全部開源。我們不是重新發明崩塌判釋，而是把既有證據整理成可追蹤的坡面履歷：機器幫忙決定先看誰，證據鏈告訴你為什麼，最後由人決定要不要去。謝謝。</w:t>
       </w:r>
     </w:p>
     <w:p>
@@ -2109,29 +2473,7 @@
           <w:i w:val="0"/>
           <w:sz w:val="22"/>
         </w:rPr>
-        <w:t>資料來源</w:t>
-      </w:r>
-      <w:r>
-        <w:rPr>
-          <w:rFonts w:ascii="Microsoft JhengHei" w:hAnsi="Microsoft JhengHei" w:eastAsia="Microsoft JhengHei" w:cs="Microsoft JhengHei"/>
-          <w:i w:val="0"/>
-          <w:sz w:val="22"/>
-        </w:rPr>
-        <w:t>：水保署 BigGIS 事件目錄與年度崩塌圖層、歷史影像平台、內政部 2025 年版 20 m DEM、Sentinel-2（Microsoft Planetary Computer，免費）、Esri Wayback；工具為 Python、WhiteboxTools、GeoPandas、Leaflet、Flask。程式在 GitHub：RhynoW/ardswc-resilience-observatory。</w:t>
-      </w:r>
-    </w:p>
-    <w:p>
-      <w:pPr>
-        <w:pStyle w:val="ListBullet"/>
-      </w:pPr>
-      <w:r>
-        <w:rPr>
-          <w:rFonts w:ascii="Microsoft JhengHei" w:hAnsi="Microsoft JhengHei" w:eastAsia="Microsoft JhengHei" w:cs="Microsoft JhengHei"/>
-          <w:b/>
-          <w:i w:val="0"/>
-          <w:sz w:val="22"/>
-        </w:rPr>
-        <w:t>五個區域</w:t>
+        <w:t>左邊圖</w:t>
       </w:r>
       <w:r>
         <w:rPr>
@@ -2140,19 +2482,6 @@
           <w:sz w:val="22"/>
         </w:rPr>
         <w:t>：</w:t>
-      </w:r>
-    </w:p>
-    <w:p>
-      <w:pPr>
-        <w:pStyle w:val="ListBullet2"/>
-      </w:pPr>
-      <w:r>
-        <w:rPr>
-          <w:rFonts w:ascii="Microsoft JhengHei" w:hAnsi="Microsoft JhengHei" w:eastAsia="Microsoft JhengHei" w:cs="Microsoft JhengHei"/>
-          <w:i w:val="0"/>
-          <w:sz w:val="22"/>
-        </w:rPr>
-        <w:t xml:space="preserve">高雄：完整證據鏈與 </w:t>
       </w:r>
       <w:r>
         <w:rPr>
@@ -2168,20 +2497,7 @@
           <w:i w:val="0"/>
           <w:sz w:val="22"/>
         </w:rPr>
-        <w:t xml:space="preserve"> 坡面頁。</w:t>
-      </w:r>
-    </w:p>
-    <w:p>
-      <w:pPr>
-        <w:pStyle w:val="ListBullet2"/>
-      </w:pPr>
-      <w:r>
-        <w:rPr>
-          <w:rFonts w:ascii="Microsoft JhengHei" w:hAnsi="Microsoft JhengHei" w:eastAsia="Microsoft JhengHei" w:cs="Microsoft JhengHei"/>
-          <w:i w:val="0"/>
-          <w:sz w:val="22"/>
-        </w:rPr>
-        <w:t xml:space="preserve">花蓮（馬太鞍溪堰塞湖）、太魯閣（0403 地震）：Sentinel-1／2 與事件目錄比對，另做了坡面單元與 NDRE 檢核，結果已放上 </w:t>
+        <w:t xml:space="preserve"> 坡面頁的 3D 檢視（CesiumJS），國土測繪中心正射航照貼在內政部 20 m DTM 上；黃線是選取的坡面（</w:t>
       </w:r>
       <w:r>
         <w:rPr>
@@ -2189,7 +2505,7 @@
           <w:i w:val="0"/>
           <w:sz w:val="20"/>
         </w:rPr>
-        <w:t>/poc</w:t>
+        <w:t>SU2-11500-128396</w:t>
       </w:r>
       <w:r>
         <w:rPr>
@@ -2197,20 +2513,7 @@
           <w:i w:val="0"/>
           <w:sz w:val="22"/>
         </w:rPr>
-        <w:t xml:space="preserve"> 的花蓮、太魯閣分頁。</w:t>
-      </w:r>
-    </w:p>
-    <w:p>
-      <w:pPr>
-        <w:pStyle w:val="ListBullet2"/>
-      </w:pPr>
-      <w:r>
-        <w:rPr>
-          <w:rFonts w:ascii="Microsoft JhengHei" w:hAnsi="Microsoft JhengHei" w:eastAsia="Microsoft JhengHei" w:cs="Microsoft JhengHei"/>
-          <w:i w:val="0"/>
-          <w:sz w:val="22"/>
-        </w:rPr>
-        <w:t>中部、嘉義：Sentinel-1／2 與事件目錄比對。</w:t>
+        <w:t>，位在高市DF059 土石流潛勢溪流集水區，影響範圍內保全住戶 79 戶）。3D 中可切 OSM、Wayback、2014–2025 逐年航照，並疊地調所順向坡、歷史山崩、地質敏感區與國土測繪中心光達地形變異。</w:t>
       </w:r>
     </w:p>
     <w:p>
@@ -2257,7 +2560,7 @@
           <w:i w:val="0"/>
           <w:sz w:val="22"/>
         </w:rPr>
-        <w:t>決賽前若已有回收結果，這句要更新。</w:t>
+        <w:t>決賽前若已有回收結果，要補一句。</w:t>
       </w:r>
     </w:p>
     <w:p>
@@ -2271,7 +2574,7 @@
           <w:i w:val="0"/>
           <w:sz w:val="22"/>
         </w:rPr>
-        <w:t>已停止的方向</w:t>
+        <w:t>已停止或降級的方向</w:t>
       </w:r>
       <w:r>
         <w:rPr>
@@ -2279,7 +2582,7 @@
           <w:i w:val="0"/>
           <w:sz w:val="22"/>
         </w:rPr>
-        <w:t>：3D、UAV、自動套合、250 m 網格熱點；依陳組長建議降為未來延伸，網站上已隱藏。</w:t>
+        <w:t>：3D 建模、UAV 擴充、自動套合、250 m 網格熱點；依陳組長建議不再是主線。UAV 已完成的 35 組與坡面頁的 3D 地形檢視保留為展示。</w:t>
       </w:r>
     </w:p>
     <w:p>
@@ -2307,7 +2610,127 @@
           <w:color w:val="2C5F2D"/>
           <w:sz w:val="30"/>
         </w:rPr>
-        <w:t>第 7 頁（備用）　對照崩塌智慧防災構想：現在在哪、下一步</w:t>
+        <w:t>第 8 頁（備用）　驗證細節：訊號只能「請人看」</w:t>
+      </w:r>
+    </w:p>
+    <w:p>
+      <w:r>
+        <w:rPr>
+          <w:rFonts w:ascii="Microsoft JhengHei" w:hAnsi="Microsoft JhengHei" w:eastAsia="Microsoft JhengHei" w:cs="Microsoft JhengHei"/>
+          <w:i w:val="0"/>
+          <w:sz w:val="22"/>
+        </w:rPr>
+        <w:t>評審追問準確度、樣本數或方法時再翻。數字定義見第 6 頁的表格。</w:t>
+      </w:r>
+    </w:p>
+    <w:p>
+      <w:r>
+        <w:rPr>
+          <w:rFonts w:ascii="Microsoft JhengHei" w:hAnsi="Microsoft JhengHei" w:eastAsia="Microsoft JhengHei" w:cs="Microsoft JhengHei"/>
+          <w:b/>
+          <w:i w:val="0"/>
+          <w:sz w:val="22"/>
+        </w:rPr>
+        <w:t>講稿</w:t>
+      </w:r>
+    </w:p>
+    <w:p>
+      <w:pPr>
+        <w:pBdr>
+          <w:left w:val="single" w:sz="18" w:space="8" w:color="2C5F2D"/>
+        </w:pBdr>
+        <w:ind w:left="227"/>
+      </w:pPr>
+      <w:r>
+        <w:rPr>
+          <w:rFonts w:ascii="Microsoft JhengHei" w:hAnsi="Microsoft JhengHei" w:eastAsia="Microsoft JhengHei" w:cs="Microsoft JhengHei"/>
+          <w:i w:val="0"/>
+          <w:sz w:val="24"/>
+        </w:rPr>
+        <w:t>我們不只做系統，也量了它準不準。影像目視與官方圖層的有無裸露一致率只有 69%；舊版近期變化訊號約四分之一屬實。改用紅邊指標後，高雄全區零星的下降經分層盲判只有約 25% 屬實；但在大事件後，花蓮有 75%、太魯閣有 43% 的崩塌坡面被抓到，誤報約 2%。左邊這張圖是太魯閣：崩塌占坡面不到 5% 時只抓到 7%，超過四成時抓到 93%。</w:t>
+      </w:r>
+    </w:p>
+    <w:p>
+      <w:r>
+        <w:rPr>
+          <w:rFonts w:ascii="Microsoft JhengHei" w:hAnsi="Microsoft JhengHei" w:eastAsia="Microsoft JhengHei" w:cs="Microsoft JhengHei"/>
+          <w:b/>
+          <w:i w:val="0"/>
+          <w:sz w:val="22"/>
+        </w:rPr>
+        <w:t>背景</w:t>
+      </w:r>
+    </w:p>
+    <w:p>
+      <w:pPr>
+        <w:pStyle w:val="ListBullet"/>
+      </w:pPr>
+      <w:r>
+        <w:rPr>
+          <w:rFonts w:ascii="Microsoft JhengHei" w:hAnsi="Microsoft JhengHei" w:eastAsia="Microsoft JhengHei" w:cs="Microsoft JhengHei"/>
+          <w:b/>
+          <w:i w:val="0"/>
+          <w:sz w:val="22"/>
+        </w:rPr>
+        <w:t>約 1/4</w:t>
+      </w:r>
+      <w:r>
+        <w:rPr>
+          <w:rFonts w:ascii="Microsoft JhengHei" w:hAnsi="Microsoft JhengHei" w:eastAsia="Microsoft JhengHei" w:cs="Microsoft JhengHei"/>
+          <w:i w:val="0"/>
+          <w:sz w:val="22"/>
+        </w:rPr>
+        <w:t>：舊版「近期有變化」訊號（事件歸因、Sentinel-2 真彩色兩期規則）在 24 個分層坡面驗證中的 S1 層 1/4 屬實（舊版 v1 單元），95% CI 5–70%。</w:t>
+      </w:r>
+    </w:p>
+    <w:p>
+      <w:pPr>
+        <w:pStyle w:val="ListBullet"/>
+      </w:pPr>
+      <w:r>
+        <w:rPr>
+          <w:rFonts w:ascii="Microsoft JhengHei" w:hAnsi="Microsoft JhengHei" w:eastAsia="Microsoft JhengHei" w:cs="Microsoft JhengHei"/>
+          <w:b/>
+          <w:i w:val="0"/>
+          <w:sz w:val="22"/>
+        </w:rPr>
+        <w:t>紅邊有沒有比 NDVI 好</w:t>
+      </w:r>
+      <w:r>
+        <w:rPr>
+          <w:rFonts w:ascii="Microsoft JhengHei" w:hAnsi="Microsoft JhengHei" w:eastAsia="Microsoft JhengHei" w:cs="Microsoft JhengHei"/>
+          <w:i w:val="0"/>
+          <w:sz w:val="22"/>
+        </w:rPr>
+        <w:t>：小試驗中 NDVI、NDRE、MTCI 抓到同一批坡面，紅邊沒有明顯優勢；選 NDRE 是因為 B5、B8A 都是 20 m，不需重採樣。</w:t>
+      </w:r>
+    </w:p>
+    <w:p>
+      <w:pPr>
+        <w:pBdr>
+          <w:bottom w:val="single" w:sz="6" w:space="1" w:color="C8D3CA"/>
+        </w:pBdr>
+      </w:pPr>
+    </w:p>
+    <w:p>
+      <w:pPr>
+        <w:pStyle w:val="Heading1"/>
+        <w:spacing w:before="280"/>
+      </w:pPr>
+      <w:r>
+        <w:rPr>
+          <w:b/>
+        </w:rPr>
+      </w:r>
+      <w:r>
+        <w:rPr>
+          <w:rFonts w:ascii="Microsoft JhengHei" w:hAnsi="Microsoft JhengHei" w:eastAsia="Microsoft JhengHei" w:cs="Microsoft JhengHei"/>
+          <w:b/>
+          <w:i w:val="0"/>
+          <w:color w:val="2C5F2D"/>
+          <w:sz w:val="30"/>
+        </w:rPr>
+        <w:t>第 9 頁（備用）　對照崩塌智慧防災構想：現在在哪、下一步</w:t>
       </w:r>
     </w:p>
     <w:p>
@@ -2517,7 +2940,7 @@
           <w:i w:val="0"/>
           <w:sz w:val="22"/>
         </w:rPr>
-        <w:t>：BigGIS 的「地礦中心地質圖（五萬分之一）」是地礦中心的影像圖磚，不是向量；公開可下載的只有全臺地層面（小比例尺，約 1,600 個多邊形，沒有斷層與位態），已用來做第 8 頁的各地層崩塌密度。斷層緩衝、順向坡判釋需要五萬分之一向量，要向水保署或地礦中心申請。</w:t>
+        <w:t>：BigGIS 的「地礦中心地質圖（五萬分之一）」是地礦中心的影像圖磚，不是向量；公開可下載的只有全臺地層面（小比例尺，約 1,600 個多邊形，沒有斷層與位態），已用來做第 10 頁的各地層崩塌密度。斷層緩衝、順向坡判釋需要五萬分之一向量，要向水保署或地礦中心申請。</w:t>
       </w:r>
     </w:p>
     <w:p>
@@ -2637,7 +3060,7 @@
           <w:color w:val="2C5F2D"/>
           <w:sz w:val="30"/>
         </w:rPr>
-        <w:t>第 8 頁（備用）　地質：哪些地層比較容易崩（粗尺度）</w:t>
+        <w:t>第 10 頁（備用）　地質：哪些地層比較容易崩（粗尺度）</w:t>
       </w:r>
     </w:p>
     <w:p>
@@ -2963,7 +3386,7 @@
           <w:i w:val="0"/>
           <w:sz w:val="22"/>
         </w:rPr>
-        <w:t>還沒有。地質決定哪裡容易壞、降雨決定何時壞；我們目前做的是事件後找出變化並排出先看誰。用公開的小比例尺地層圖做了粗尺度的各地層崩塌密度：西村層板岩是平均的 1.5 倍（備用第 8 頁）。五萬分之一地質在 BigGIS 上是影像圖磚，要取得向量才能做斷層距離與順向坡分析，這是下一步。</w:t>
+        <w:t>還沒有。地質決定哪裡容易壞、降雨決定何時壞；我們目前做的是事件後找出變化並排出先看誰。用公開的小比例尺地層圖做了粗尺度的各地層崩塌密度：西村層板岩是平均的 1.5 倍（備用第 10 頁）。五萬分之一地質在 BigGIS 上是影像圖磚，要取得向量才能做斷層距離與順向坡分析，這是下一步。</w:t>
       </w:r>
     </w:p>
     <w:p>
@@ -2984,7 +3407,28 @@
           <w:i w:val="0"/>
           <w:sz w:val="22"/>
         </w:rPr>
-        <w:t>用 OpenStreetMap 疊合道路與建物：每個坡面的證據頁會列出坡面內與外推 100 m 的道路長度、建物數與最近聚落。只作為參考資訊，不改候選層級。</w:t>
+        <w:t>每個坡面的證據頁列出坡面內與外推 100 m 的道路長度、建物數與最近聚落（OpenStreetMap），以及所在的土石流潛勢溪流集水區、影響範圍與保全住戶（水保署）。只作為參考資訊，不改候選層級。</w:t>
+      </w:r>
+    </w:p>
+    <w:p>
+      <w:r>
+        <w:rPr>
+          <w:rFonts w:ascii="Microsoft JhengHei" w:hAnsi="Microsoft JhengHei" w:eastAsia="Microsoft JhengHei" w:cs="Microsoft JhengHei"/>
+          <w:b/>
+          <w:i w:val="0"/>
+          <w:sz w:val="22"/>
+        </w:rPr>
+        <w:t>Q：輔導委員建議停止 3D、UAV，為什麼簡報還有？</w:t>
+      </w:r>
+    </w:p>
+    <w:p>
+      <w:r>
+        <w:rPr>
+          <w:rFonts w:ascii="Microsoft JhengHei" w:hAnsi="Microsoft JhengHei" w:eastAsia="Microsoft JhengHei" w:cs="Microsoft JhengHei"/>
+          <w:i w:val="0"/>
+          <w:sz w:val="22"/>
+        </w:rPr>
+        <w:t>我們停止的是把 3D 和 UAV 當主線、繼續擴充；主線仍是坡面證據鏈。UAV 那 35 組是已完成的成果，解決的是歷史照片沒有座標的問題；坡面頁的 3D 只是檢視工具，方便判讀者看地形，不參與任何計算。</w:t>
       </w:r>
     </w:p>
     <w:p>
@@ -3077,7 +3521,7 @@
           <w:i w:val="0"/>
           <w:sz w:val="22"/>
         </w:rPr>
-        <w:t>確認第 4 頁的動態圖在投影模式會自動循環。</w:t>
+        <w:t>確認第 5 頁的動態圖在投影模式會自動循環。</w:t>
       </w:r>
     </w:p>
     <w:p>
@@ -3090,7 +3534,7 @@
           <w:i w:val="0"/>
           <w:sz w:val="22"/>
         </w:rPr>
-        <w:t>PDF 版的動態圖只顯示第一格（地震前）；若現場只能用 PDF，第 4 頁口頭補一句「地震後同一處變成大片裸露」。</w:t>
+        <w:t>PDF 版的動態圖只顯示第一格（地震前）；若現場只能用 PDF，第 5 頁口頭補一句「地震後同一處變成大片裸露」。</w:t>
       </w:r>
     </w:p>
     <w:p>

</xml_diff>